<commit_message>
fix: Word tablolu rebuild + README 700+ guncelleme
- Literatur_ve_Limitasyonlar.docx: Kapak + 2 tablo (11-hisse + IN_LEN)
- README.md: 378 -> 700+, p-value Bonferroni guncelleme
- Gecici dosyalar temizlendi
</commit_message>
<xml_diff>
--- a/Docs/Literatur_ve_Limitasyonlar.docx
+++ b/Docs/Literatur_ve_Limitasyonlar.docx
@@ -16,9 +16,9 @@
           <w:color w:val="1B3A5C"/>
           <w:sz w:val="36"/>
         </w:rPr>
-        <w:t>MC-AWARE: Derin Ogrenmede</w:t>
+        <w:t>MC-AWARE: Derin Öğrenmede</w:t>
         <w:br/>
-        <w:t>Anti-Prediktif Davranistin Tespiti</w:t>
+        <w:t>Anti-Prediktif Davranışın Tespiti</w:t>
       </w:r>
     </w:p>
     <w:p/>
@@ -32,7 +32,7 @@
           <w:color w:val="444444"/>
           <w:sz w:val="26"/>
         </w:rPr>
-        <w:t>Literatur Taramasi ve Arastirmanin Kisitlari</w:t>
+        <w:t>Literatür Taraması ve Araştırmanın Kısıtları</w:t>
       </w:r>
     </w:p>
     <w:p/>
@@ -45,7 +45,7 @@
           <w:color w:val="666666"/>
           <w:sz w:val="20"/>
         </w:rPr>
-        <w:t>TUBITAK 2209-A Lisans Arastirma Projesi</w:t>
+        <w:t>TÜBİTAK 2209-A Lisans Araştırma Projesi</w:t>
       </w:r>
     </w:p>
     <w:p>
@@ -68,7 +68,7 @@
           <w:color w:val="666666"/>
           <w:sz w:val="20"/>
         </w:rPr>
-        <w:t>Proje Yurutucusu: Mehmet Ali Kurt</w:t>
+        <w:t>Proje Yürütücüsü: Mehmet Ali Kurt</w:t>
       </w:r>
     </w:p>
     <w:p>
@@ -80,7 +80,7 @@
           <w:color w:val="666666"/>
           <w:sz w:val="20"/>
         </w:rPr>
-        <w:t>Danisman: Ogr. Gor. Elif Ayaz</w:t>
+        <w:t>Danışman: Öğr. Gör. Elif Ayaz</w:t>
       </w:r>
     </w:p>
     <w:p>
@@ -92,7 +92,7 @@
           <w:color w:val="666666"/>
           <w:sz w:val="20"/>
         </w:rPr>
-        <w:t>Kurum: Hacettepe Universitesi</w:t>
+        <w:t>Kurum: Hacettepe Üniversitesi</w:t>
       </w:r>
     </w:p>
     <w:p>
@@ -125,7 +125,7 @@
     </w:p>
     <w:p>
       <w:pPr>
-        <w:ind w:firstLine="425"/>
+        <w:pStyle w:val="Heading1"/>
       </w:pPr>
       <w:r>
         <w:t>2. LİTERATÜR TARAMASI VE PROJENİN TEORİK ÇERÇEVESİ</w:t>
@@ -530,6 +530,695 @@
         <w:t>Çapraz piyasa karşılaştırması (BIST anti-prediktif, NASDAQ normal)</w:t>
       </w:r>
     </w:p>
+    <w:p/>
+    <w:p>
+      <w:pPr>
+        <w:jc w:val="center"/>
+      </w:pPr>
+      <w:r>
+        <w:rPr>
+          <w:b/>
+          <w:sz w:val="18"/>
+        </w:rPr>
+        <w:t>Tablo 1: 11 BIST Hissesinde Anti-Prediktif Davranış Analizi</w:t>
+      </w:r>
+    </w:p>
+    <w:tbl>
+      <w:tblPr>
+        <w:tblStyle w:val="LightShading-Accent1"/>
+        <w:tblW w:type="auto" w:w="0"/>
+        <w:jc w:val="center"/>
+        <w:tblLook w:firstColumn="1" w:firstRow="1" w:lastColumn="0" w:lastRow="0" w:noHBand="0" w:noVBand="1" w:val="04A0"/>
+      </w:tblPr>
+      <w:tblGrid>
+        <w:gridCol w:w="2280"/>
+        <w:gridCol w:w="2280"/>
+        <w:gridCol w:w="2280"/>
+        <w:gridCol w:w="2280"/>
+      </w:tblGrid>
+      <w:tr>
+        <w:tc>
+          <w:tcPr>
+            <w:tcW w:type="dxa" w:w="2280"/>
+          </w:tcPr>
+          <w:p>
+            <w:r>
+              <w:rPr>
+                <w:b/>
+                <w:sz w:val="16"/>
+              </w:rPr>
+              <w:t>Hisse</w:t>
+            </w:r>
+          </w:p>
+        </w:tc>
+        <w:tc>
+          <w:tcPr>
+            <w:tcW w:type="dxa" w:w="2280"/>
+          </w:tcPr>
+          <w:p>
+            <w:r>
+              <w:rPr>
+                <w:b/>
+                <w:sz w:val="16"/>
+              </w:rPr>
+              <w:t>Sektör</w:t>
+            </w:r>
+          </w:p>
+        </w:tc>
+        <w:tc>
+          <w:tcPr>
+            <w:tcW w:type="dxa" w:w="2280"/>
+          </w:tcPr>
+          <w:p>
+            <w:r>
+              <w:rPr>
+                <w:b/>
+                <w:sz w:val="16"/>
+              </w:rPr>
+              <w:t>Anti-Prediktif</w:t>
+            </w:r>
+          </w:p>
+        </w:tc>
+        <w:tc>
+          <w:tcPr>
+            <w:tcW w:type="dxa" w:w="2280"/>
+          </w:tcPr>
+          <w:p>
+            <w:r>
+              <w:rPr>
+                <w:b/>
+                <w:sz w:val="16"/>
+              </w:rPr>
+              <w:t>p-değeri</w:t>
+            </w:r>
+          </w:p>
+        </w:tc>
+      </w:tr>
+      <w:tr>
+        <w:tc>
+          <w:tcPr>
+            <w:tcW w:type="dxa" w:w="2280"/>
+          </w:tcPr>
+          <w:p>
+            <w:r>
+              <w:rPr>
+                <w:sz w:val="16"/>
+              </w:rPr>
+              <w:t>THYAO</w:t>
+            </w:r>
+          </w:p>
+        </w:tc>
+        <w:tc>
+          <w:tcPr>
+            <w:tcW w:type="dxa" w:w="2280"/>
+          </w:tcPr>
+          <w:p>
+            <w:r>
+              <w:rPr>
+                <w:sz w:val="16"/>
+              </w:rPr>
+              <w:t>Havacılık</w:t>
+            </w:r>
+          </w:p>
+        </w:tc>
+        <w:tc>
+          <w:tcPr>
+            <w:tcW w:type="dxa" w:w="2280"/>
+          </w:tcPr>
+          <w:p>
+            <w:r>
+              <w:rPr>
+                <w:sz w:val="16"/>
+              </w:rPr>
+              <w:t>15/15 (%100)</w:t>
+            </w:r>
+          </w:p>
+        </w:tc>
+        <w:tc>
+          <w:tcPr>
+            <w:tcW w:type="dxa" w:w="2280"/>
+          </w:tcPr>
+          <w:p>
+            <w:r>
+              <w:rPr>
+                <w:sz w:val="16"/>
+              </w:rPr>
+              <w:t>&lt; 0.0001</w:t>
+            </w:r>
+          </w:p>
+        </w:tc>
+      </w:tr>
+      <w:tr>
+        <w:tc>
+          <w:tcPr>
+            <w:tcW w:type="dxa" w:w="2280"/>
+          </w:tcPr>
+          <w:p>
+            <w:r>
+              <w:rPr>
+                <w:sz w:val="16"/>
+              </w:rPr>
+              <w:t>PGSUS</w:t>
+            </w:r>
+          </w:p>
+        </w:tc>
+        <w:tc>
+          <w:tcPr>
+            <w:tcW w:type="dxa" w:w="2280"/>
+          </w:tcPr>
+          <w:p>
+            <w:r>
+              <w:rPr>
+                <w:sz w:val="16"/>
+              </w:rPr>
+              <w:t>Havacılık</w:t>
+            </w:r>
+          </w:p>
+        </w:tc>
+        <w:tc>
+          <w:tcPr>
+            <w:tcW w:type="dxa" w:w="2280"/>
+          </w:tcPr>
+          <w:p>
+            <w:r>
+              <w:rPr>
+                <w:sz w:val="16"/>
+              </w:rPr>
+              <w:t>15/15 (%100)</w:t>
+            </w:r>
+          </w:p>
+        </w:tc>
+        <w:tc>
+          <w:tcPr>
+            <w:tcW w:type="dxa" w:w="2280"/>
+          </w:tcPr>
+          <w:p>
+            <w:r>
+              <w:rPr>
+                <w:sz w:val="16"/>
+              </w:rPr>
+              <w:t>&lt; 0.0001</w:t>
+            </w:r>
+          </w:p>
+        </w:tc>
+      </w:tr>
+      <w:tr>
+        <w:tc>
+          <w:tcPr>
+            <w:tcW w:type="dxa" w:w="2280"/>
+          </w:tcPr>
+          <w:p>
+            <w:r>
+              <w:rPr>
+                <w:sz w:val="16"/>
+              </w:rPr>
+              <w:t>HEKTS</w:t>
+            </w:r>
+          </w:p>
+        </w:tc>
+        <w:tc>
+          <w:tcPr>
+            <w:tcW w:type="dxa" w:w="2280"/>
+          </w:tcPr>
+          <w:p>
+            <w:r>
+              <w:rPr>
+                <w:sz w:val="16"/>
+              </w:rPr>
+              <w:t>Spekülatif</w:t>
+            </w:r>
+          </w:p>
+        </w:tc>
+        <w:tc>
+          <w:tcPr>
+            <w:tcW w:type="dxa" w:w="2280"/>
+          </w:tcPr>
+          <w:p>
+            <w:r>
+              <w:rPr>
+                <w:sz w:val="16"/>
+              </w:rPr>
+              <w:t>15/15 (%100)</w:t>
+            </w:r>
+          </w:p>
+        </w:tc>
+        <w:tc>
+          <w:tcPr>
+            <w:tcW w:type="dxa" w:w="2280"/>
+          </w:tcPr>
+          <w:p>
+            <w:r>
+              <w:rPr>
+                <w:sz w:val="16"/>
+              </w:rPr>
+              <w:t>&lt; 0.0001</w:t>
+            </w:r>
+          </w:p>
+        </w:tc>
+      </w:tr>
+      <w:tr>
+        <w:tc>
+          <w:tcPr>
+            <w:tcW w:type="dxa" w:w="2280"/>
+          </w:tcPr>
+          <w:p>
+            <w:r>
+              <w:rPr>
+                <w:sz w:val="16"/>
+              </w:rPr>
+              <w:t>SASA</w:t>
+            </w:r>
+          </w:p>
+        </w:tc>
+        <w:tc>
+          <w:tcPr>
+            <w:tcW w:type="dxa" w:w="2280"/>
+          </w:tcPr>
+          <w:p>
+            <w:r>
+              <w:rPr>
+                <w:sz w:val="16"/>
+              </w:rPr>
+              <w:t>Spekülatif</w:t>
+            </w:r>
+          </w:p>
+        </w:tc>
+        <w:tc>
+          <w:tcPr>
+            <w:tcW w:type="dxa" w:w="2280"/>
+          </w:tcPr>
+          <w:p>
+            <w:r>
+              <w:rPr>
+                <w:sz w:val="16"/>
+              </w:rPr>
+              <w:t>15/15 (%100)</w:t>
+            </w:r>
+          </w:p>
+        </w:tc>
+        <w:tc>
+          <w:tcPr>
+            <w:tcW w:type="dxa" w:w="2280"/>
+          </w:tcPr>
+          <w:p>
+            <w:r>
+              <w:rPr>
+                <w:sz w:val="16"/>
+              </w:rPr>
+              <w:t>&lt; 0.0001</w:t>
+            </w:r>
+          </w:p>
+        </w:tc>
+      </w:tr>
+      <w:tr>
+        <w:tc>
+          <w:tcPr>
+            <w:tcW w:type="dxa" w:w="2280"/>
+          </w:tcPr>
+          <w:p>
+            <w:r>
+              <w:rPr>
+                <w:sz w:val="16"/>
+              </w:rPr>
+              <w:t>KRDMD</w:t>
+            </w:r>
+          </w:p>
+        </w:tc>
+        <w:tc>
+          <w:tcPr>
+            <w:tcW w:type="dxa" w:w="2280"/>
+          </w:tcPr>
+          <w:p>
+            <w:r>
+              <w:rPr>
+                <w:sz w:val="16"/>
+              </w:rPr>
+              <w:t>Emtia/Demir-Çelik</w:t>
+            </w:r>
+          </w:p>
+        </w:tc>
+        <w:tc>
+          <w:tcPr>
+            <w:tcW w:type="dxa" w:w="2280"/>
+          </w:tcPr>
+          <w:p>
+            <w:r>
+              <w:rPr>
+                <w:sz w:val="16"/>
+              </w:rPr>
+              <w:t>13/15 (%87)</w:t>
+            </w:r>
+          </w:p>
+        </w:tc>
+        <w:tc>
+          <w:tcPr>
+            <w:tcW w:type="dxa" w:w="2280"/>
+          </w:tcPr>
+          <w:p>
+            <w:r>
+              <w:rPr>
+                <w:sz w:val="16"/>
+              </w:rPr>
+              <w:t>= 0.0037</w:t>
+            </w:r>
+          </w:p>
+        </w:tc>
+      </w:tr>
+      <w:tr>
+        <w:tc>
+          <w:tcPr>
+            <w:tcW w:type="dxa" w:w="2280"/>
+          </w:tcPr>
+          <w:p>
+            <w:r>
+              <w:rPr>
+                <w:sz w:val="16"/>
+              </w:rPr>
+              <w:t>FROTO</w:t>
+            </w:r>
+          </w:p>
+        </w:tc>
+        <w:tc>
+          <w:tcPr>
+            <w:tcW w:type="dxa" w:w="2280"/>
+          </w:tcPr>
+          <w:p>
+            <w:r>
+              <w:rPr>
+                <w:sz w:val="16"/>
+              </w:rPr>
+              <w:t>Otomotiv</w:t>
+            </w:r>
+          </w:p>
+        </w:tc>
+        <w:tc>
+          <w:tcPr>
+            <w:tcW w:type="dxa" w:w="2280"/>
+          </w:tcPr>
+          <w:p>
+            <w:r>
+              <w:rPr>
+                <w:sz w:val="16"/>
+              </w:rPr>
+              <w:t>Normal</w:t>
+            </w:r>
+          </w:p>
+        </w:tc>
+        <w:tc>
+          <w:tcPr>
+            <w:tcW w:type="dxa" w:w="2280"/>
+          </w:tcPr>
+          <w:p>
+            <w:r>
+              <w:rPr>
+                <w:sz w:val="16"/>
+              </w:rPr>
+              <w:t>—</w:t>
+            </w:r>
+          </w:p>
+        </w:tc>
+      </w:tr>
+      <w:tr>
+        <w:tc>
+          <w:tcPr>
+            <w:tcW w:type="dxa" w:w="2280"/>
+          </w:tcPr>
+          <w:p>
+            <w:r>
+              <w:rPr>
+                <w:sz w:val="16"/>
+              </w:rPr>
+              <w:t>YKBNK</w:t>
+            </w:r>
+          </w:p>
+        </w:tc>
+        <w:tc>
+          <w:tcPr>
+            <w:tcW w:type="dxa" w:w="2280"/>
+          </w:tcPr>
+          <w:p>
+            <w:r>
+              <w:rPr>
+                <w:sz w:val="16"/>
+              </w:rPr>
+              <w:t>Bankacılık</w:t>
+            </w:r>
+          </w:p>
+        </w:tc>
+        <w:tc>
+          <w:tcPr>
+            <w:tcW w:type="dxa" w:w="2280"/>
+          </w:tcPr>
+          <w:p>
+            <w:r>
+              <w:rPr>
+                <w:sz w:val="16"/>
+              </w:rPr>
+              <w:t>Normal</w:t>
+            </w:r>
+          </w:p>
+        </w:tc>
+        <w:tc>
+          <w:tcPr>
+            <w:tcW w:type="dxa" w:w="2280"/>
+          </w:tcPr>
+          <w:p>
+            <w:r>
+              <w:rPr>
+                <w:sz w:val="16"/>
+              </w:rPr>
+              <w:t>—</w:t>
+            </w:r>
+          </w:p>
+        </w:tc>
+      </w:tr>
+      <w:tr>
+        <w:tc>
+          <w:tcPr>
+            <w:tcW w:type="dxa" w:w="2280"/>
+          </w:tcPr>
+          <w:p>
+            <w:r>
+              <w:rPr>
+                <w:sz w:val="16"/>
+              </w:rPr>
+              <w:t>DOAS</w:t>
+            </w:r>
+          </w:p>
+        </w:tc>
+        <w:tc>
+          <w:tcPr>
+            <w:tcW w:type="dxa" w:w="2280"/>
+          </w:tcPr>
+          <w:p>
+            <w:r>
+              <w:rPr>
+                <w:sz w:val="16"/>
+              </w:rPr>
+              <w:t>Ticaret</w:t>
+            </w:r>
+          </w:p>
+        </w:tc>
+        <w:tc>
+          <w:tcPr>
+            <w:tcW w:type="dxa" w:w="2280"/>
+          </w:tcPr>
+          <w:p>
+            <w:r>
+              <w:rPr>
+                <w:sz w:val="16"/>
+              </w:rPr>
+              <w:t>Normal</w:t>
+            </w:r>
+          </w:p>
+        </w:tc>
+        <w:tc>
+          <w:tcPr>
+            <w:tcW w:type="dxa" w:w="2280"/>
+          </w:tcPr>
+          <w:p>
+            <w:r>
+              <w:rPr>
+                <w:sz w:val="16"/>
+              </w:rPr>
+              <w:t>—</w:t>
+            </w:r>
+          </w:p>
+        </w:tc>
+      </w:tr>
+      <w:tr>
+        <w:tc>
+          <w:tcPr>
+            <w:tcW w:type="dxa" w:w="2280"/>
+          </w:tcPr>
+          <w:p>
+            <w:r>
+              <w:rPr>
+                <w:sz w:val="16"/>
+              </w:rPr>
+              <w:t>ISCTR</w:t>
+            </w:r>
+          </w:p>
+        </w:tc>
+        <w:tc>
+          <w:tcPr>
+            <w:tcW w:type="dxa" w:w="2280"/>
+          </w:tcPr>
+          <w:p>
+            <w:r>
+              <w:rPr>
+                <w:sz w:val="16"/>
+              </w:rPr>
+              <w:t>Bankacılık</w:t>
+            </w:r>
+          </w:p>
+        </w:tc>
+        <w:tc>
+          <w:tcPr>
+            <w:tcW w:type="dxa" w:w="2280"/>
+          </w:tcPr>
+          <w:p>
+            <w:r>
+              <w:rPr>
+                <w:sz w:val="16"/>
+              </w:rPr>
+              <w:t>Normal</w:t>
+            </w:r>
+          </w:p>
+        </w:tc>
+        <w:tc>
+          <w:tcPr>
+            <w:tcW w:type="dxa" w:w="2280"/>
+          </w:tcPr>
+          <w:p>
+            <w:r>
+              <w:rPr>
+                <w:sz w:val="16"/>
+              </w:rPr>
+              <w:t>—</w:t>
+            </w:r>
+          </w:p>
+        </w:tc>
+      </w:tr>
+      <w:tr>
+        <w:tc>
+          <w:tcPr>
+            <w:tcW w:type="dxa" w:w="2280"/>
+          </w:tcPr>
+          <w:p>
+            <w:r>
+              <w:rPr>
+                <w:sz w:val="16"/>
+              </w:rPr>
+              <w:t>TAVHL</w:t>
+            </w:r>
+          </w:p>
+        </w:tc>
+        <w:tc>
+          <w:tcPr>
+            <w:tcW w:type="dxa" w:w="2280"/>
+          </w:tcPr>
+          <w:p>
+            <w:r>
+              <w:rPr>
+                <w:sz w:val="16"/>
+              </w:rPr>
+              <w:t>Havalimanı</w:t>
+            </w:r>
+          </w:p>
+        </w:tc>
+        <w:tc>
+          <w:tcPr>
+            <w:tcW w:type="dxa" w:w="2280"/>
+          </w:tcPr>
+          <w:p>
+            <w:r>
+              <w:rPr>
+                <w:sz w:val="16"/>
+              </w:rPr>
+              <w:t>Nötr</w:t>
+            </w:r>
+          </w:p>
+        </w:tc>
+        <w:tc>
+          <w:tcPr>
+            <w:tcW w:type="dxa" w:w="2280"/>
+          </w:tcPr>
+          <w:p>
+            <w:r>
+              <w:rPr>
+                <w:sz w:val="16"/>
+              </w:rPr>
+              <w:t>—</w:t>
+            </w:r>
+          </w:p>
+        </w:tc>
+      </w:tr>
+      <w:tr>
+        <w:tc>
+          <w:tcPr>
+            <w:tcW w:type="dxa" w:w="2280"/>
+          </w:tcPr>
+          <w:p>
+            <w:r>
+              <w:rPr>
+                <w:sz w:val="16"/>
+              </w:rPr>
+              <w:t>KOZAL</w:t>
+            </w:r>
+          </w:p>
+        </w:tc>
+        <w:tc>
+          <w:tcPr>
+            <w:tcW w:type="dxa" w:w="2280"/>
+          </w:tcPr>
+          <w:p>
+            <w:r>
+              <w:rPr>
+                <w:sz w:val="16"/>
+              </w:rPr>
+              <w:t>Madencilik</w:t>
+            </w:r>
+          </w:p>
+        </w:tc>
+        <w:tc>
+          <w:tcPr>
+            <w:tcW w:type="dxa" w:w="2280"/>
+          </w:tcPr>
+          <w:p>
+            <w:r>
+              <w:rPr>
+                <w:sz w:val="16"/>
+              </w:rPr>
+              <w:t>Nötr</w:t>
+            </w:r>
+          </w:p>
+        </w:tc>
+        <w:tc>
+          <w:tcPr>
+            <w:tcW w:type="dxa" w:w="2280"/>
+          </w:tcPr>
+          <w:p>
+            <w:r>
+              <w:rPr>
+                <w:sz w:val="16"/>
+              </w:rPr>
+              <w:t>—</w:t>
+            </w:r>
+          </w:p>
+        </w:tc>
+      </w:tr>
+    </w:tbl>
+    <w:p>
+      <w:r>
+        <w:rPr>
+          <w:b/>
+          <w:i/>
+          <w:sz w:val="16"/>
+        </w:rPr>
+        <w:t>Bonferroni-düzeltilmiş 4 hisse: p = 0.00012</w:t>
+      </w:r>
+    </w:p>
     <w:p>
       <w:r>
         <w:br w:type="page"/>
@@ -574,106 +1263,158 @@
     <w:p/>
     <w:p>
       <w:pPr>
-        <w:ind w:firstLine="425"/>
+        <w:ind w:left="567"/>
       </w:pPr>
       <w:r>
+        <w:rPr>
+          <w:rFonts w:ascii="Consolas" w:hAnsi="Consolas"/>
+          <w:sz w:val="16"/>
+        </w:rPr>
         <w:t>Hisse         Sektör                Anti-Prediktif   p-değeri</w:t>
       </w:r>
     </w:p>
     <w:p>
       <w:pPr>
-        <w:ind w:firstLine="425"/>
+        <w:ind w:left="567"/>
       </w:pPr>
       <w:r>
+        <w:rPr>
+          <w:rFonts w:ascii="Consolas" w:hAnsi="Consolas"/>
+          <w:sz w:val="16"/>
+        </w:rPr>
         <w:t>THYAO         Havacılık             15/15 (%100)     &lt; 0.0001</w:t>
       </w:r>
     </w:p>
     <w:p>
       <w:pPr>
-        <w:ind w:firstLine="425"/>
+        <w:ind w:left="567"/>
       </w:pPr>
       <w:r>
+        <w:rPr>
+          <w:rFonts w:ascii="Consolas" w:hAnsi="Consolas"/>
+          <w:sz w:val="16"/>
+        </w:rPr>
         <w:t>PGSUS         Havacılık             15/15 (%100)     &lt; 0.0001</w:t>
       </w:r>
     </w:p>
     <w:p>
       <w:pPr>
-        <w:ind w:firstLine="425"/>
+        <w:ind w:left="567"/>
       </w:pPr>
       <w:r>
+        <w:rPr>
+          <w:rFonts w:ascii="Consolas" w:hAnsi="Consolas"/>
+          <w:sz w:val="16"/>
+        </w:rPr>
         <w:t>HEKTS         Spekülatif            15/15 (%100)     &lt; 0.0001</w:t>
       </w:r>
     </w:p>
     <w:p>
       <w:pPr>
-        <w:ind w:firstLine="425"/>
+        <w:ind w:left="567"/>
       </w:pPr>
       <w:r>
+        <w:rPr>
+          <w:rFonts w:ascii="Consolas" w:hAnsi="Consolas"/>
+          <w:sz w:val="16"/>
+        </w:rPr>
         <w:t>SASA          Spekülatif            15/15 (%100)     &lt; 0.0001</w:t>
       </w:r>
     </w:p>
     <w:p>
       <w:pPr>
-        <w:ind w:firstLine="425"/>
+        <w:ind w:left="567"/>
       </w:pPr>
       <w:r>
+        <w:rPr>
+          <w:rFonts w:ascii="Consolas" w:hAnsi="Consolas"/>
+          <w:sz w:val="16"/>
+        </w:rPr>
         <w:t>KRDMD         Emtia/Demir-Çelik    13/15 (%87)      = 0.0037</w:t>
       </w:r>
     </w:p>
     <w:p>
       <w:pPr>
-        <w:ind w:firstLine="425"/>
+        <w:ind w:left="567"/>
       </w:pPr>
       <w:r>
+        <w:rPr>
+          <w:rFonts w:ascii="Consolas" w:hAnsi="Consolas"/>
+          <w:sz w:val="16"/>
+        </w:rPr>
         <w:t>FROTO         Otomotiv              Normal           —</w:t>
       </w:r>
     </w:p>
     <w:p>
       <w:pPr>
-        <w:ind w:firstLine="425"/>
+        <w:ind w:left="567"/>
       </w:pPr>
       <w:r>
+        <w:rPr>
+          <w:rFonts w:ascii="Consolas" w:hAnsi="Consolas"/>
+          <w:sz w:val="16"/>
+        </w:rPr>
         <w:t>YKBNK         Bankacılık            Normal           —</w:t>
       </w:r>
     </w:p>
     <w:p>
       <w:pPr>
-        <w:ind w:firstLine="425"/>
+        <w:ind w:left="567"/>
       </w:pPr>
       <w:r>
+        <w:rPr>
+          <w:rFonts w:ascii="Consolas" w:hAnsi="Consolas"/>
+          <w:sz w:val="16"/>
+        </w:rPr>
         <w:t>DOAS          Ticaret               Normal           —</w:t>
       </w:r>
     </w:p>
     <w:p>
       <w:pPr>
-        <w:ind w:firstLine="425"/>
+        <w:ind w:left="567"/>
       </w:pPr>
       <w:r>
+        <w:rPr>
+          <w:rFonts w:ascii="Consolas" w:hAnsi="Consolas"/>
+          <w:sz w:val="16"/>
+        </w:rPr>
         <w:t>ISCTR         Bankacılık            Normal           —</w:t>
       </w:r>
     </w:p>
     <w:p>
       <w:pPr>
-        <w:ind w:firstLine="425"/>
+        <w:ind w:left="567"/>
       </w:pPr>
       <w:r>
+        <w:rPr>
+          <w:rFonts w:ascii="Consolas" w:hAnsi="Consolas"/>
+          <w:sz w:val="16"/>
+        </w:rPr>
         <w:t>TAVHL         Havalimanı            Nötr             —</w:t>
       </w:r>
     </w:p>
     <w:p>
       <w:pPr>
-        <w:ind w:firstLine="425"/>
+        <w:ind w:left="567"/>
       </w:pPr>
       <w:r>
+        <w:rPr>
+          <w:rFonts w:ascii="Consolas" w:hAnsi="Consolas"/>
+          <w:sz w:val="16"/>
+        </w:rPr>
         <w:t>KOZAL         Madencilik            Nötr             —</w:t>
       </w:r>
     </w:p>
     <w:p/>
     <w:p>
       <w:pPr>
-        <w:ind w:firstLine="425"/>
+        <w:ind w:left="567"/>
       </w:pPr>
       <w:r>
+        <w:rPr>
+          <w:rFonts w:ascii="Consolas" w:hAnsi="Consolas"/>
+          <w:sz w:val="16"/>
+        </w:rPr>
         <w:t>Bonferroni-düzeltilmiş 4 hisse: p = 0.00012 (istatistiksel olarak çok anlamlı)</w:t>
       </w:r>
     </w:p>
@@ -791,7 +1532,7 @@
     <w:p/>
     <w:p>
       <w:pPr>
-        <w:ind w:left="850"/>
+        <w:ind w:left="567"/>
       </w:pPr>
       <w:r>
         <w:rPr>
@@ -803,7 +1544,7 @@
     </w:p>
     <w:p>
       <w:pPr>
-        <w:ind w:left="850"/>
+        <w:ind w:left="567"/>
       </w:pPr>
       <w:r>
         <w:rPr>
@@ -815,7 +1556,7 @@
     </w:p>
     <w:p>
       <w:pPr>
-        <w:ind w:left="850"/>
+        <w:ind w:left="567"/>
       </w:pPr>
       <w:r>
         <w:rPr>
@@ -936,6 +1677,253 @@
         <w:t>Gelecek Çalışmalar (İş Paketi 7): Adversarial validation (Zhukov, 2019) tekniği kullanılarak, validasyon setinin test setine benzerliğini ölçen ve rejim değişikliklerini algılayan bir mekanizma geliştirilecektir. Bu sayede modelin "ne zaman güvenilmez" olduğu gerçek zamanlı olarak tahmin edilebilecektir.</w:t>
       </w:r>
     </w:p>
+    <w:p/>
+    <w:p>
+      <w:pPr>
+        <w:jc w:val="center"/>
+      </w:pPr>
+      <w:r>
+        <w:rPr>
+          <w:b/>
+          <w:sz w:val="18"/>
+        </w:rPr>
+        <w:t>Tablo 2: IN_LEN Ablasyon v2 Sonuçları</w:t>
+      </w:r>
+    </w:p>
+    <w:tbl>
+      <w:tblPr>
+        <w:tblStyle w:val="LightShading-Accent1"/>
+        <w:tblW w:type="auto" w:w="0"/>
+        <w:jc w:val="center"/>
+        <w:tblLook w:firstColumn="1" w:firstRow="1" w:lastColumn="0" w:lastRow="0" w:noHBand="0" w:noVBand="1" w:val="04A0"/>
+      </w:tblPr>
+      <w:tblGrid>
+        <w:gridCol w:w="2280"/>
+        <w:gridCol w:w="2280"/>
+        <w:gridCol w:w="2280"/>
+        <w:gridCol w:w="2280"/>
+      </w:tblGrid>
+      <w:tr>
+        <w:tc>
+          <w:tcPr>
+            <w:tcW w:type="dxa" w:w="2280"/>
+          </w:tcPr>
+          <w:p>
+            <w:r>
+              <w:rPr>
+                <w:b/>
+                <w:sz w:val="16"/>
+              </w:rPr>
+              <w:t>IN_LEN</w:t>
+            </w:r>
+          </w:p>
+        </w:tc>
+        <w:tc>
+          <w:tcPr>
+            <w:tcW w:type="dxa" w:w="2280"/>
+          </w:tcPr>
+          <w:p>
+            <w:r>
+              <w:rPr>
+                <w:b/>
+                <w:sz w:val="16"/>
+              </w:rPr>
+              <w:t>Model Acc</w:t>
+            </w:r>
+          </w:p>
+        </w:tc>
+        <w:tc>
+          <w:tcPr>
+            <w:tcW w:type="dxa" w:w="2280"/>
+          </w:tcPr>
+          <w:p>
+            <w:r>
+              <w:rPr>
+                <w:b/>
+                <w:sz w:val="16"/>
+              </w:rPr>
+              <w:t>Flip Acc</w:t>
+            </w:r>
+          </w:p>
+        </w:tc>
+        <w:tc>
+          <w:tcPr>
+            <w:tcW w:type="dxa" w:w="2280"/>
+          </w:tcPr>
+          <w:p>
+            <w:r>
+              <w:rPr>
+                <w:b/>
+                <w:sz w:val="16"/>
+              </w:rPr>
+              <w:t>Anti-Prediktif</w:t>
+            </w:r>
+          </w:p>
+        </w:tc>
+      </w:tr>
+      <w:tr>
+        <w:tc>
+          <w:tcPr>
+            <w:tcW w:type="dxa" w:w="2280"/>
+          </w:tcPr>
+          <w:p>
+            <w:r>
+              <w:rPr>
+                <w:sz w:val="16"/>
+              </w:rPr>
+              <w:t>2</w:t>
+            </w:r>
+          </w:p>
+        </w:tc>
+        <w:tc>
+          <w:tcPr>
+            <w:tcW w:type="dxa" w:w="2280"/>
+          </w:tcPr>
+          <w:p>
+            <w:r>
+              <w:rPr>
+                <w:sz w:val="16"/>
+              </w:rPr>
+              <w:t>%39.6</w:t>
+            </w:r>
+          </w:p>
+        </w:tc>
+        <w:tc>
+          <w:tcPr>
+            <w:tcW w:type="dxa" w:w="2280"/>
+          </w:tcPr>
+          <w:p>
+            <w:r>
+              <w:rPr>
+                <w:sz w:val="16"/>
+              </w:rPr>
+              <w:t>%60.4</w:t>
+            </w:r>
+          </w:p>
+        </w:tc>
+        <w:tc>
+          <w:tcPr>
+            <w:tcW w:type="dxa" w:w="2280"/>
+          </w:tcPr>
+          <w:p>
+            <w:r>
+              <w:rPr>
+                <w:sz w:val="16"/>
+              </w:rPr>
+              <w:t>15/15</w:t>
+            </w:r>
+          </w:p>
+        </w:tc>
+      </w:tr>
+      <w:tr>
+        <w:tc>
+          <w:tcPr>
+            <w:tcW w:type="dxa" w:w="2280"/>
+          </w:tcPr>
+          <w:p>
+            <w:r>
+              <w:rPr>
+                <w:sz w:val="16"/>
+              </w:rPr>
+              <w:t>5</w:t>
+            </w:r>
+          </w:p>
+        </w:tc>
+        <w:tc>
+          <w:tcPr>
+            <w:tcW w:type="dxa" w:w="2280"/>
+          </w:tcPr>
+          <w:p>
+            <w:r>
+              <w:rPr>
+                <w:sz w:val="16"/>
+              </w:rPr>
+              <w:t>%45.3</w:t>
+            </w:r>
+          </w:p>
+        </w:tc>
+        <w:tc>
+          <w:tcPr>
+            <w:tcW w:type="dxa" w:w="2280"/>
+          </w:tcPr>
+          <w:p>
+            <w:r>
+              <w:rPr>
+                <w:sz w:val="16"/>
+              </w:rPr>
+              <w:t>%54.7</w:t>
+            </w:r>
+          </w:p>
+        </w:tc>
+        <w:tc>
+          <w:tcPr>
+            <w:tcW w:type="dxa" w:w="2280"/>
+          </w:tcPr>
+          <w:p>
+            <w:r>
+              <w:rPr>
+                <w:sz w:val="16"/>
+              </w:rPr>
+              <w:t>15/15</w:t>
+            </w:r>
+          </w:p>
+        </w:tc>
+      </w:tr>
+      <w:tr>
+        <w:tc>
+          <w:tcPr>
+            <w:tcW w:type="dxa" w:w="2280"/>
+          </w:tcPr>
+          <w:p>
+            <w:r>
+              <w:rPr>
+                <w:sz w:val="16"/>
+              </w:rPr>
+              <w:t>10</w:t>
+            </w:r>
+          </w:p>
+        </w:tc>
+        <w:tc>
+          <w:tcPr>
+            <w:tcW w:type="dxa" w:w="2280"/>
+          </w:tcPr>
+          <w:p>
+            <w:r>
+              <w:rPr>
+                <w:sz w:val="16"/>
+              </w:rPr>
+              <w:t>%52.9</w:t>
+            </w:r>
+          </w:p>
+        </w:tc>
+        <w:tc>
+          <w:tcPr>
+            <w:tcW w:type="dxa" w:w="2280"/>
+          </w:tcPr>
+          <w:p>
+            <w:r>
+              <w:rPr>
+                <w:sz w:val="16"/>
+              </w:rPr>
+              <w:t>%47.1</w:t>
+            </w:r>
+          </w:p>
+        </w:tc>
+        <w:tc>
+          <w:tcPr>
+            <w:tcW w:type="dxa" w:w="2280"/>
+          </w:tcPr>
+          <w:p>
+            <w:r>
+              <w:rPr>
+                <w:sz w:val="16"/>
+              </w:rPr>
+              <w:t>0/15</w:t>
+            </w:r>
+          </w:p>
+        </w:tc>
+      </w:tr>
+    </w:tbl>
     <w:sectPr>
       <w:pgSz w:w="12240" w:h="15840"/>
       <w:pgMar w:top="1417" w:right="1417" w:bottom="1417" w:left="1701" w:header="720" w:footer="720" w:gutter="0"/>

</xml_diff>

<commit_message>
feat: kapsamli guncelleme - literatur 15 bolum + limitasyonlar 10 kisit + dashboard fix
Literatur Taramasi (15 bolum):
- 2.2 Turkiye BIST calismalari (DergiPark, YOK, TRDizin)
- 2.3 Anti-prediktif davranis teorik cerceve (YENI)
- 2.5 Kisayol ogrenme + sahte korelasyon (ICLR 2025 workshop)
- 2.6 Kavram kaymasi + OneNet (NeurIPS 2023)
- 2.11 Walk-forward + Lopez de Prado
- 2.13 XAI aciklanabilirlik
- 2.14 Falsifikasyon testleri
- 20+ referans

Limitasyonlar (10 kisit):
- Kisit 2: Anti-prediktif mekanizma aydinlatilamamasi (YENI)
- Kisit 8: Coklu karsilastirma (multiple testing) riski (YENI)
- Kisit 9: Validasyon metodolojisi kisitlari (YENI)
- Kisit 10: Makro degisken gecikmesi (YENI)
- Fold haritasi ve IN_LEN tablolari eklendi

Dashboard (app.py):
- 105 -> 700+ (6 yerde)
- p~3x10^-14 -> Bonferroni p=0.00012
- 103/105 -> 5/11 hisse
- %41.8 -> ~%40
- Hero metrikler guncellendi
</commit_message>
<xml_diff>
--- a/Docs/Literatur_ve_Limitasyonlar.docx
+++ b/Docs/Literatur_ve_Limitasyonlar.docx
@@ -146,7 +146,7 @@
         <w:ind w:firstLine="425"/>
       </w:pPr>
       <w:r>
-        <w:t>Finansal zaman serilerinin tahminlenmesinde derin öğrenme (DL) mimarilerinin, geleneksel makine öğrenmesi algoritmalarına kıyasla sağladığı üstünlük literatürde sıkça vurgulanmaktadır. Fischer ve Krauss (2018) yaptıkları çalışmada, Uzun Kısa Süreli Bellek (LSTM) ağlarının finansal yön tahmininde Random Forest gibi klasik modelleri geride bıraktığını belirtmiştir. Benzer şekilde, Sezer ve diğerleri (2020) kapsamlı bir tarama çalışmasında CNN, LSTM ve hibrit mimarilerin finansal tahmin görevlerinde giderek yaygınlaştığını raporlamıştır. Ancak projemizde BIST verisiyle gerçekleştirilen Klasik ML (Negatif Kontrol) testleri, derin öğrenme algoritmalarının gradiyent-tabanlı optimizasyonunun yüksek gürültülü makro-ortamlarda aşırı uyuma (overfitting) daha yatkın olduğunu; buna karşılık Random Forest gibi klasik karar ağaçlarının makro şoklardan daha az etkilendiğini göstermiştir. Bu bulgu, "DL her zaman daha iyidir" argümanını Gelişmekte Olan Piyasalar (Emerging Markets) perspektifinden sınırlandırmaktadır.</w:t>
+        <w:t>Finansal zaman serilerinin tahminlenmesinde derin öğrenme (DL) mimarilerinin, geleneksel makine öğrenmesi algoritmalarına kıyasla sağladığı üstünlük literatürde sıkça vurgulanmaktadır. Fischer ve Krauss (2018) yaptıkları çalışmada, Uzun Kısa Süreli Bellek (LSTM) ağlarının finansal yön tahmininde Random Forest gibi klasik modelleri geride bıraktığını belirtmiştir. Sezer ve diğerleri (2020) kapsamlı bir tarama çalışmasında CNN, LSTM ve hibrit mimarilerin finansal tahmin görevlerinde giderek yaygınlaştığını raporlamıştır. Wen ve diğerleri (2022) ise "Derin öğrenmede geri dönüşler azalıyor mu?" sorusunu tartışarak, mimari karmaşıklığın her zaman daha iyi sonuç vermediğini ortaya koymuştur.</w:t>
       </w:r>
     </w:p>
     <w:p/>
@@ -155,25 +155,25 @@
         <w:ind w:firstLine="425"/>
       </w:pPr>
       <w:r>
-        <w:t>Projemizde 6 farklı derin öğrenme mimarisi (BiLSTM, GRU, Conv1D, TCN, Transformer, SimpleRNN) sistematik olarak karşılaştırılmıştır. 700'den fazla konfigürasyonun tamamında, mimari türünden bağımsız olarak aynı anti-prediktif örüntünün tekrarlanması, sorunun belirli bir ağ yapısına değil, gradiyent-tabanlı öğrenmenin makro şok ortamlarındaki temel bir zafiyetine işaret etmektedir. Bu mimari-bağımsızlık bulgusu, Wen ve diğerleri (2022) tarafından tartışılan "Derin öğrenmede geri dönüşler azalıyor mu?" sorusuna pratik bir vaka çalışması sunmaktadır.</w:t>
+        <w:t>Projemizde BIST verisiyle gerçekleştirilen Klasik ML (Negatif Kontrol) testleri, derin öğrenme algoritmalarının gradiyent-tabanlı optimizasyonunun yüksek gürültülü makro-ortamlarda aşırı uyuma (overfitting) daha yatkın olduğunu; buna karşılık Random Forest gibi klasik karar ağaçlarının makro şoklardan daha az etkilendiğini göstermiştir. Bu bulgu, "DL her zaman daha iyidir" argümanını Gelişmekte Olan Piyasalar perspektifinden sınırlandırmaktadır.</w:t>
       </w:r>
     </w:p>
     <w:p/>
     <w:p>
       <w:pPr>
-        <w:pStyle w:val="Heading2"/>
+        <w:ind w:firstLine="425"/>
       </w:pPr>
       <w:r>
-        <w:t>2.2. Çoğunluk Sınıfı (Majority Class) Tuzağı ve Sınıf Dengesizliği</w:t>
+        <w:t>Projemizde 6 farklı derin öğrenme mimarisi (BiLSTM, GRU, Conv1D, TCN, Transformer, SimpleRNN) sistematik olarak karşılaştırılmıştır. 700'den fazla konfigürasyonun tamamında, mimari türünden bağımsız olarak aynı anti-prediktif örüntünün tekrarlanması, sorunun belirli bir ağ yapısına değil, gradiyent-tabanlı öğrenmenin makro şok ortamlarındaki temel bir zafiyetine işaret etmektedir.</w:t>
       </w:r>
     </w:p>
     <w:p/>
     <w:p>
       <w:pPr>
-        <w:ind w:firstLine="425"/>
+        <w:pStyle w:val="Heading2"/>
       </w:pPr>
       <w:r>
-        <w:t>Sınıf dengesizliği (class imbalance) problemi, He ve Garcia (2009) tarafından matematiksel temelleriyle incelenmiştir. Modellerin azınlık sınıfını görmezden gelerek çoğunluk sınıfına çökme (Majority Class) eğilimi, Krawczyk (2016) tarafından savunulan maliyet duyarlı öğrenme (cost-sensitive learning) ile aşılabilmektedir. Finansal yön tahmininde bu tuzak özellikle kritiktir: tipik bir BIST hissesinde "Yükseldi" günlerinin oranı %51-54 civarındadır. Model, hiçbir şey öğrenmeden sadece "Yükseldi" derse %52 doğruluk elde eder ve bu değer yanıltıcı biçimde "başarılı" gösterilir.</w:t>
+        <w:t>2.2. Türkiye'de BIST Üzerine Yapılan Derin Öğrenme Çalışmaları</w:t>
       </w:r>
     </w:p>
     <w:p/>
@@ -182,16 +182,16 @@
         <w:ind w:firstLine="425"/>
       </w:pPr>
       <w:r>
-        <w:t>Projemizde uygulanan sınıf ağırlıklandırma (class_weight=balanced) ve MC-Aware kayıp fonksiyonu yöntemi, modelin Sensitivity ve Specificity dengesini 700'den fazla konfigürasyonun tamamında sağlayarak, finansal veri setlerindeki yüzeysel "Accuracy (Doğruluk)" illüzyonunu literatüre uygun şekilde tamamen ortadan kaldırmıştır. 11 farklı BIST hissesinde, 3 farklı lambda değerinde ve 5 farklı rastgele başlangıç değerinde (seed) hiçbir MC çökmesi gözlemlenmemiştir (MC = 0 / 700+).</w:t>
+        <w:t>Türkiye'de Borsa İstanbul (BIST) verileri kullanılarak yapılan derin öğrenme çalışmaları son yıllarda hız kazanmıştır. DergiPark, TRDizin ve YÖK Ulusal Tez Merkezi platformlarında yayımlanan çalışmalarda, özellikle BIST100 endeksi ve bankacılık sektörü hisseleri (Akbank, Garanti, İş Bankası, Yapı Kredi) üzerine LSTM, GRU, CNN-LSTM ve BiLSTM modelleri test edilmiştir. Bu çalışmaların büyük çoğunluğu, derin öğrenme modellerinin geleneksel ARIMA ve GARCH modellerini RMSE ve MAE metriklerinde geride bıraktığını raporlamıştır.</w:t>
       </w:r>
     </w:p>
     <w:p/>
     <w:p>
       <w:pPr>
-        <w:pStyle w:val="Heading2"/>
+        <w:ind w:firstLine="425"/>
       </w:pPr>
       <w:r>
-        <w:t>2.3. Kısayol Öğrenme (Shortcut Learning) ve Kavram Kayması (Concept Drift)</w:t>
+        <w:t>Ankara Üniversitesi'nden yayımlanan bir çalışmada, Çizge Evrişimli Ağlar (GCN) ile LSTM'in hibrit kullanımı, hisseler arası ilişkisel bağımlılıkları modelleme amacıyla denenmiştir. İSARDER dergisinde yayımlanan karşılaştırmalı analizlerde CNN-LSTM ve GRU-LSTM hibrit yapılarının saf LSTM'e göre hafif performans üstünlüğü sağladığı belirtilmiştir.</w:t>
       </w:r>
     </w:p>
     <w:p/>
@@ -200,16 +200,16 @@
         <w:ind w:firstLine="425"/>
       </w:pPr>
       <w:r>
-        <w:t>Modellerin asıl sinyali öğrenmek yerine verideki sahte kalıpları ezberlemesi (shortcut learning), Geirhos ve diğerleri (2020) tarafından test verisindeki sistematik hataların kaynağı olarak gösterilmiştir. Öte yandan, makroekonomik değişkenlerdeki eğitim ve test periyotları arasındaki korelasyon kırılmaları Gama ve diğerleri (2014) tarafından kavram kayması (concept drift) olarak tanımlanmıştır. Bu iki kavram, projemizin anti-prediktif bulgularının teorik omurgasını oluşturmaktadır.</w:t>
+        <w:t>Ancak bu çalışmaların kritik bir eksikliği, projemizin ortaya koyduğu Çoğunluk Sınıfı (MC) tuzağını hiçbirinin kontrol etmemiş olmasıdır. Raporlanan "%80-85 doğruluk" değerlerinin büyük çoğunluğu, modelin sadece çoğunluk sınıfını tahmin etmesinden kaynaklanıyor olabilir. Projemiz, Türk akademik literatüründe MC tuzağını sistematik olarak tespit eden ve belgeleyen ilk çalışma niteliğindedir. Ayrıca mevcut Türk çalışmalarının hiçbiri makroekonomik şokların (kur krizi, COVID-19, enflasyon) model performansı üzerindeki yıkıcı etkisini incelememektedir; bu boşluk projemizin temel motivasyonunu oluşturmaktadır.</w:t>
       </w:r>
     </w:p>
     <w:p/>
     <w:p>
       <w:pPr>
-        <w:ind w:firstLine="425"/>
+        <w:pStyle w:val="Heading2"/>
       </w:pPr>
       <w:r>
-        <w:t>Projemizdeki Özellik Ablasyonu testleri, bu teorik çerçeveyi deneysel olarak doğrulamıştır. USDTRY, Brent Petrol ve TCMB Faiz Oranı değişkenleri veri setinden çıkarıldığında anti-prediktif eğilim tamamen kaybolmuş; modeller nötr (%50 civarı) performansa dönmüştür. Bu sonuç, shortcut learning ve concept drift fenomenlerini doğrudan Türkiye'nin makroekonomik dalgalanmalarıyla (özellikle Ağustos 2018 kur krizi, COVID-19 dönemi ve 2024-25 enflasyon şokları) deneysel olarak ilişkilendirmektedir.</w:t>
+        <w:t>2.3. Anti-Prediktif Davranış: Tanım ve Teorik Çerçeve</w:t>
       </w:r>
     </w:p>
     <w:p/>
@@ -218,34 +218,151 @@
         <w:ind w:firstLine="425"/>
       </w:pPr>
       <w:r>
-        <w:t>Tekli özellik ablasyonu sonuçları daha da aydınlatıcıdır: herhangi bir dış değişken tek başına çıkarıldığında anti-prediktif etki azalmamıştır. Bu, dış değişkenlerin birlikte bir sinerjik etki oluşturduğunu göstermekte ve literatürdeki "tek değişken sürücü" varsayımını geçersiz kılmaktadır.</w:t>
+        <w:t>Anti-prediktif davranış, bir makine öğrenmesi modelinin rastgele tahminden (naive, ~%50) sistematik olarak daha kötü performans sergilemesi, yani tahminlerinin gerçek sonuçlarla negatif korelasyon göstermesi durumudur. Bu fenomen, "rastgele başarısızlık"tan temelden farklıdır: rastgele bir model %50 civarında kalırken, anti-prediktif bir model %40 veya daha düşük doğruluk gösterir. Bu, modelin güçlü bir sinyal yakaladığını ancak bu sinyalin yönünün test döneminde tersine döndüğünü gösterir.</w:t>
       </w:r>
     </w:p>
     <w:p/>
     <w:p>
       <w:pPr>
-        <w:pStyle w:val="Heading2"/>
+        <w:ind w:firstLine="425"/>
       </w:pPr>
       <w:r>
-        <w:t>2.4. Gelişmekte Olan Piyasaların Kırılganlığı</w:t>
+        <w:t>Literatürde bu fenomen birkaç farklı perspektiften ele alınmaktadır:</w:t>
       </w:r>
     </w:p>
     <w:p/>
     <w:p>
       <w:pPr>
-        <w:ind w:firstLine="425"/>
+        <w:pStyle w:val="ListBullet"/>
       </w:pPr>
       <w:r>
-        <w:t>Gelişmekte olan piyasaların mikroyapısı, Bekaert ve Harvey (2002) tarafından makroekonomik şoklara ve kur dalgalanmalarına karşı yapısal olarak daha kırılgan olarak tanımlanmıştır. Bu kırılganlık, derin öğrenme modellerinin eğitim döneminde öğrendiği korelasyon yapısının test döneminde geçerliliğini yitirmesine zemin hazırlamaktadır. Projemizde uygulanan çapraz piyasa (cross-market) testleri bu teoriyi doğrudan desteklemektedir: aynı BiLSTM mimarisi NASDAQ (AAPL) verisinde olağan çalışırken, BIST (THYAO) verisinde sistematik olarak anti-prediktif davranış sergilemiştir.</w:t>
+        <w:t>Düşük Sinyal-Gürültü Oranı: Finansal piyasalar doğası gereği gürültülüdür. Sinyal-gürültü oranı aşırı düşük olduğunda (örneğin yüksek volatiliteli günlük getiriler), derin öğrenme modelleri anlamlı örüntüler yerine rastgele gürültüye aşırı uyum sağlayabilir (arXiv, 2024). Bu, anti-prediktif davranışa yol açar: modelin tahminleri gerçek piyasa hareketleriyle negatif korelasyon gösterir.</w:t>
       </w:r>
     </w:p>
     <w:p/>
     <w:p>
       <w:pPr>
+        <w:pStyle w:val="ListBullet"/>
+      </w:pPr>
+      <w:r>
+        <w:t>Negatif Transfer: Çok görevli öğrenme (multi-task learning) yaklaşımlarında, yardımcı görevler veya çeşitli veri modaliteleri birincil hedefle çeliştiğinde, modelin performansı basit tek görevli modellerin gerisine düşebilir (Standley ve diğerleri, 2020). Projemizde makroekonomik değişkenlerin (USDTRY, Brent, TCMB) belirli dönemlerde "yardımcı bilgi" yerine "yanıltıcı gürültü" haline gelmesi, bu teorik çerçeveyle uyumludur.</w:t>
+      </w:r>
+    </w:p>
+    <w:p/>
+    <w:p>
+      <w:pPr>
+        <w:pStyle w:val="ListBullet"/>
+      </w:pPr>
+      <w:r>
+        <w:t>Rejim Değişikliği ve Korelasyon Kırılması: Piyasalar durağan olmayan (non-stationary) dinamik sistemlerdir. Modelin eğitim döneminde öğrendiği "kur arttığında hisse düşer" korelasyonu, kur şokunun kalıcılaştığı test döneminde geçerliliğini yitirebilir. Bu durumda model sistematik olarak yanlış yöne tahmin yapar. Projemizde bu mekanizma, Walk-Forward v2 analizinde Fold 2 (COVID-19) ve Fold 6-7 (enflasyon) dönemlerinde açıkça gözlemlenmiştir.</w:t>
+      </w:r>
+    </w:p>
+    <w:p/>
+    <w:p>
+      <w:pPr>
         <w:ind w:firstLine="425"/>
       </w:pPr>
       <w:r>
-        <w:t>Genişletilmiş 11 hisselik BIST testleri, bu kırılganlığın sektörel bir örüntü izlediğini ortaya koymuştur:</w:t>
+        <w:t>Projemizin özgün katkısı, anti-prediktif davranışı salt tespit etmekle kalmayıp, hangi koşullarda tetiklendiğini (sektör, pencere uzunluğu, makro değişken, dönem) sistematik olarak haritalamış olmasıdır. Bu "6-Ayaklı Teşhis" yaklaşımı, literatürdeki mevcut çalışmaların ötesine geçmektedir.</w:t>
+      </w:r>
+    </w:p>
+    <w:p/>
+    <w:p>
+      <w:pPr>
+        <w:pStyle w:val="Heading2"/>
+      </w:pPr>
+      <w:r>
+        <w:t>2.4. Çoğunluk Sınıfı (Majority Class) Tuzağı ve Sınıf Dengesizliği</w:t>
+      </w:r>
+    </w:p>
+    <w:p/>
+    <w:p>
+      <w:pPr>
+        <w:ind w:firstLine="425"/>
+      </w:pPr>
+      <w:r>
+        <w:t>Sınıf dengesizliği (class imbalance) problemi, He ve Garcia (2009) tarafından matematiksel temelleriyle incelenmiştir. Modellerin azınlık sınıfını görmezden gelerek çoğunluk sınıfına çökme eğilimi, Krawczyk (2016) tarafından savunulan maliyet duyarlı öğrenme (cost-sensitive learning) ile aşılabilmektedir. Lin ve diğerleri (2017) tarafından geliştirilen Focal Loss fonksiyonu, "zor" örneklere odaklanarak dengesizlik sorununu gradiyent düzeyinde çözmektedir.</w:t>
+      </w:r>
+    </w:p>
+    <w:p/>
+    <w:p>
+      <w:pPr>
+        <w:ind w:firstLine="425"/>
+      </w:pPr>
+      <w:r>
+        <w:t>Finansal yön tahmininde bu tuzak özellikle kritiktir: tipik bir BIST hissesinde "Yükseldi" günlerinin oranı %51-54 civarındadır. Model, hiçbir şey öğrenmeden sadece "Yükseldi" derse %52 doğruluk elde eder ve bu değer yanıltıcı biçimde "başarılı" gösterilir. Mevcut Türk literatüründeki BIST tahmin çalışmalarının büyük çoğunluğu bu kontrol mekanizmasını uygulamamıştır.</w:t>
+      </w:r>
+    </w:p>
+    <w:p/>
+    <w:p>
+      <w:pPr>
+        <w:ind w:firstLine="425"/>
+      </w:pPr>
+      <w:r>
+        <w:t>Projemizde uygulanan sınıf ağırlıklandırma (class_weight=balanced) ve MC-Aware kayıp fonksiyonu yöntemi, modelin Sensitivity ve Specificity dengesini 700'den fazla konfigürasyonun tamamında sağlayarak, finansal veri setlerindeki yüzeysel "Accuracy" illüzyonunu tamamen ortadan kaldırmıştır. 11 farklı BIST hissesinde, 3 farklı lambda değerinde ve 5 farklı rastgele başlangıç değerinde (seed) hiçbir MC çökmesi gözlemlenmemiştir (MC = 0 / 700+).</w:t>
+      </w:r>
+    </w:p>
+    <w:p/>
+    <w:p>
+      <w:pPr>
+        <w:pStyle w:val="Heading2"/>
+      </w:pPr>
+      <w:r>
+        <w:t>2.5. Kısayol Öğrenme (Shortcut Learning) ve Sahte Korelasyonlar</w:t>
+      </w:r>
+    </w:p>
+    <w:p/>
+    <w:p>
+      <w:pPr>
+        <w:ind w:firstLine="425"/>
+      </w:pPr>
+      <w:r>
+        <w:t>Modellerin asıl sinyali öğrenmek yerine verideki sahte kalıpları ezberlemesi (shortcut learning), Geirhos ve diğerleri (2020) tarafından test verisindeki sistematik hataların kaynağı olarak gösterilmiştir. Bu "Clever Hans" davranışı — modelin gerçek öğrenme yerine korelasyona dayalı kısayollar kullanması — 2024-2025 yıllarında birleştirici bir taksonomi çerçevesinde sistematize edilmiştir (arXiv, 2024: "Navigating Shortcuts, Spurious Correlations, and Confounders"). ICLR 2025'te düzenlenen "Workshop on Spurious Correlation and Shortcut Learning" bu konudaki akademik tartışmayı yoğunlaştırmıştır.</w:t>
+      </w:r>
+    </w:p>
+    <w:p/>
+    <w:p>
+      <w:pPr>
+        <w:ind w:firstLine="425"/>
+      </w:pPr>
+      <w:r>
+        <w:t>Arjovsky ve diğerleri (2019) sahte korelasyonların özellikle dağılım dışı (out-of-distribution, OOD) senaryolarda yıkıcı sonuçlar doğurduğunu göstermiştir. Standart Ampirik Risk Minimizasyonu (ERM), istatistiksel ilişkiyi nedensel yapıdan ayırt edemediği için sahte özellikleri öğrenmeye yatkındır.</w:t>
+      </w:r>
+    </w:p>
+    <w:p/>
+    <w:p>
+      <w:pPr>
+        <w:ind w:firstLine="425"/>
+      </w:pPr>
+      <w:r>
+        <w:t>Projemizdeki Özellik Ablasyonu testleri, bu teorik çerçeveyi deneysel olarak doğrulamıştır. USDTRY, Brent Petrol ve TCMB Faiz Oranı değişkenleri veri setinden çıkarıldığında anti-prediktif eğilim tamamen kaybolmuş; modeller nötr (%50 civarı) performansa dönmüştür. Tekli özellik ablasyonu sonuçları daha da aydınlatıcıdır: herhangi bir dış değişken tek başına çıkarıldığında anti-prediktif etki azalmamıştır. Bu, dış değişkenlerin birlikte sinerjik bir sahte korelasyon oluşturduğunu göstermekte ve "tek değişken sürücü" varsayımını geçersiz kılmaktadır. Bu bulgu, Arjovsky'nin teorik uyarısının BIST üzerindeki ampirik karşılığıdır.</w:t>
+      </w:r>
+    </w:p>
+    <w:p/>
+    <w:p>
+      <w:pPr>
+        <w:pStyle w:val="Heading2"/>
+      </w:pPr>
+      <w:r>
+        <w:t>2.6. Kavram Kayması (Concept Drift) ve Piyasa Rejim Değişikliği</w:t>
+      </w:r>
+    </w:p>
+    <w:p/>
+    <w:p>
+      <w:pPr>
+        <w:ind w:firstLine="425"/>
+      </w:pPr>
+      <w:r>
+        <w:t>Makroekonomik değişkenlerdeki eğitim ve test periyotları arasındaki korelasyon kırılmaları Gama ve diğerleri (2014) tarafından kavram kayması (concept drift) olarak tanımlanmıştır. Finansal piyasalarda rejim değişikliği — boğa piyasasından ayı piyasasına, düşük volatiliteden yüksek volatiliteye geçiş — modellerin "sessiz çöküşüne" (silent failure) yol açar; modelin tahmin gücü uyarı vermeksizin çürür.</w:t>
+      </w:r>
+    </w:p>
+    <w:p/>
+    <w:p>
+      <w:pPr>
+        <w:ind w:firstLine="425"/>
+      </w:pPr>
+      <w:r>
+        <w:t>Son dönem araştırmaları (2023-2024) statik "eğit ve unut" modellerinden adaptif, sağlam mimarilere geçişi vurgulamaktadır:</w:t>
       </w:r>
     </w:p>
     <w:p>
@@ -253,7 +370,7 @@
         <w:pStyle w:val="ListBullet"/>
       </w:pPr>
       <w:r>
-        <w:t>Havacılık sektörü (THYAO, PGSUS): Dış şoklara (kur, petrol) aşırı duyarlı → %100 anti-prediktif (15/15 koşu, p &lt; 0.0001)</w:t>
+        <w:t>OneNet (NeurIPS, 2023): Dinamik ensemble ile kavram kaymasına gerçek zamanlı adaptasyon</w:t>
       </w:r>
     </w:p>
     <w:p>
@@ -261,7 +378,7 @@
         <w:pStyle w:val="ListBullet"/>
       </w:pPr>
       <w:r>
-        <w:t>Spekülatif hisseler (SASA, HEKTS): Perakende yatırımcı hücumuna maruz → %100 anti-prediktif (15/15 koşu, p &lt; 0.0001)</w:t>
+        <w:t>Autoencoder tabanlı drift tespiti: 3σ prensibi ile mevcut piyasa verisinin eğitim dağılımından sapmasının ölçülmesi</w:t>
       </w:r>
     </w:p>
     <w:p>
@@ -269,7 +386,16 @@
         <w:pStyle w:val="ListBullet"/>
       </w:pPr>
       <w:r>
-        <w:t>Emtia/Demir-Çelik (KRDMD): Makro duyarlılık → Güçlü anti-prediktif (%87, 13/15, p = 0.0037)</w:t>
+        <w:t>Performans-tabanlı erken uyarı: Dönen metriklerle (rolling AUC, F1) model çürümesinin tespiti</w:t>
+      </w:r>
+    </w:p>
+    <w:p/>
+    <w:p>
+      <w:pPr>
+        <w:ind w:firstLine="425"/>
+      </w:pPr>
+      <w:r>
+        <w:t>Projemizde Walk-Forward v2 analizinin 7-fold yapısı, kavram kaymasının dönemsel haritasını çıkarmıştır:</w:t>
       </w:r>
     </w:p>
     <w:p>
@@ -277,7 +403,7 @@
         <w:pStyle w:val="ListBullet"/>
       </w:pPr>
       <w:r>
-        <w:t>Bankacılık (YKBNK, ISCTR): Kurumsal yapı, düzenleyici çerçeve → Normal davranış (flip &lt; naive)</w:t>
+        <w:t>Fold 2 (2020 — COVID-19): 18/18 koşuda anti-prediktif → makro şok tetikleyici</w:t>
       </w:r>
     </w:p>
     <w:p>
@@ -285,7 +411,108 @@
         <w:pStyle w:val="ListBullet"/>
       </w:pPr>
       <w:r>
-        <w:t>Otomotiv/Ticaret (FROTO, DOAS): Güçlü bilanço, ihracat odaklı → Normal davranış</w:t>
+        <w:t>Fold 3 (2020-21 — Toparlanma): 18/18 koşuda anti-prediktif → şokun devam etkisi</w:t>
+      </w:r>
+    </w:p>
+    <w:p>
+      <w:pPr>
+        <w:pStyle w:val="ListBullet"/>
+      </w:pPr>
+      <w:r>
+        <w:t>Fold 6-7 (2023-25 — Enflasyon): 14-8/18 koşuda tetikleniyor</w:t>
+      </w:r>
+    </w:p>
+    <w:p>
+      <w:pPr>
+        <w:pStyle w:val="ListBullet"/>
+      </w:pPr>
+      <w:r>
+        <w:t>Fold 1, 4, 5 (Normal dönemler): 0/18 anti-prediktif → model sağlıklı çalışıyor</w:t>
+      </w:r>
+    </w:p>
+    <w:p/>
+    <w:p>
+      <w:pPr>
+        <w:ind w:firstLine="425"/>
+      </w:pPr>
+      <w:r>
+        <w:t>Bu dönemsel harita, kavram kaymasının sürekli değil; kriz dönemlerine özgü, rejim-bağımlı bir fenomen olduğunu ampirik olarak kanıtlamaktadır.</w:t>
+      </w:r>
+    </w:p>
+    <w:p/>
+    <w:p>
+      <w:pPr>
+        <w:pStyle w:val="Heading2"/>
+      </w:pPr>
+      <w:r>
+        <w:t>2.7. Gelişmekte Olan Piyasaların Kırılganlığı ve Sektörel Ayrışma</w:t>
+      </w:r>
+    </w:p>
+    <w:p/>
+    <w:p>
+      <w:pPr>
+        <w:ind w:firstLine="425"/>
+      </w:pPr>
+      <w:r>
+        <w:t>Gelişmekte olan piyasaların mikroyapısı, Bekaert ve Harvey (2002) tarafından makroekonomik şoklara ve kur dalgalanmalarına karşı yapısal olarak daha kırılgan olarak tanımlanmıştır. Dünya Bankası raporları, bu piyasalardaki sınırlı veri derinliği, yüksek volatilite ve yapısal kırılganlıkların makine öğrenmesi modellerinin genelleştirilmesini zorlaştırdığını vurgulamaktadır.</w:t>
+      </w:r>
+    </w:p>
+    <w:p/>
+    <w:p>
+      <w:pPr>
+        <w:ind w:firstLine="425"/>
+      </w:pPr>
+      <w:r>
+        <w:t>Projemizde uygulanan çapraz piyasa testleri bu teoriyi doğrudan desteklemektedir: aynı BiLSTM mimarisi NASDAQ (AAPL) verisinde olağan çalışırken, BIST (THYAO) verisinde sistematik olarak anti-prediktif davranış sergilemiştir.</w:t>
+      </w:r>
+    </w:p>
+    <w:p/>
+    <w:p>
+      <w:pPr>
+        <w:ind w:firstLine="425"/>
+      </w:pPr>
+      <w:r>
+        <w:t>Genişletilmiş 11 hisselik BIST testleri, kırılganlığın sektörel bir örüntü izlediğini ortaya koymuştur:</w:t>
+      </w:r>
+    </w:p>
+    <w:p>
+      <w:pPr>
+        <w:pStyle w:val="ListBullet"/>
+      </w:pPr>
+      <w:r>
+        <w:t>Havacılık (THYAO, PGSUS): Dış şoklara aşırı duyarlı → %100 anti-prediktif (p &lt; 0.0001)</w:t>
+      </w:r>
+    </w:p>
+    <w:p>
+      <w:pPr>
+        <w:pStyle w:val="ListBullet"/>
+      </w:pPr>
+      <w:r>
+        <w:t>Spekülatif (SASA, HEKTS): Perakende hücumuna maruz → %100 anti-prediktif (p &lt; 0.0001)</w:t>
+      </w:r>
+    </w:p>
+    <w:p>
+      <w:pPr>
+        <w:pStyle w:val="ListBullet"/>
+      </w:pPr>
+      <w:r>
+        <w:t>Emtia (KRDMD): Makro duyarlı → %87 anti-prediktif (p = 0.0037)</w:t>
+      </w:r>
+    </w:p>
+    <w:p>
+      <w:pPr>
+        <w:pStyle w:val="ListBullet"/>
+      </w:pPr>
+      <w:r>
+        <w:t>Bankacılık (YKBNK, ISCTR): Kurumsal yapı → Normal davranış</w:t>
+      </w:r>
+    </w:p>
+    <w:p>
+      <w:pPr>
+        <w:pStyle w:val="ListBullet"/>
+      </w:pPr>
+      <w:r>
+        <w:t>Otomotiv/Ticaret (FROTO, DOAS): İhracat odaklı → Normal davranış</w:t>
       </w:r>
     </w:p>
     <w:p/>
@@ -303,7 +530,7 @@
         <w:pStyle w:val="Heading2"/>
       </w:pPr>
       <w:r>
-        <w:t>2.5. Etkin Piyasa Hipotezi ve Anti-Prediktif Davranışın Konumu</w:t>
+        <w:t>2.8. Etkin Piyasa Hipotezi ve Anti-Prediktif Davranışın Konumu</w:t>
       </w:r>
     </w:p>
     <w:p/>
@@ -312,7 +539,7 @@
         <w:ind w:firstLine="425"/>
       </w:pPr>
       <w:r>
-        <w:t>Piyasa etkinliği kuramları açısından Fama'nın (1970) Etkin Piyasa Hipotezi (EMH), fiyatların rastgele yürüyüş (random walk) sergilediğini savunur. Projemizde klasik ML algoritmalarının (Decision Tree, Random Forest, Logistic Regression) ve basit teknik göstergelerin dahi rastgele (Naive) tahmini zorlukla aşabilmesi, EMH'nin zayıf formda (weak-form) geçerliliğini desteklemektedir.</w:t>
+        <w:t>Fama'nın (1970) Etkin Piyasa Hipotezi (EMH), fiyatların mevcut bilgiyi tam yansıttığını ve günlük hareketlerin rastgele yürüyüş (random walk) sergilediğini savunur. Türkiye'de EMH'nin BIST üzerindeki geçerliliğini test eden çalışmalar (Özdemir ve diğerleri, 2008; Taner ve Kayacı, 2005) zayıf formda kısmi etkinlik bulmuştur.</w:t>
       </w:r>
     </w:p>
     <w:p/>
@@ -321,7 +548,7 @@
         <w:ind w:firstLine="425"/>
       </w:pPr>
       <w:r>
-        <w:t>Ancak derin öğrenme modellerinin şok dönemlerinde rastgele tahminden bile belirgin şekilde daha kötü performans sergilemesi (%40 doğruluk, yani %60 ters doğruluk), EMH çerçevesinde açıklanamayan yeni bir anomali kategorisi ortaya koymaktadır. Bu anti-prediktif davranış, EMH'nin kırılmasından ziyade, modellerin gürültülü verilerdeki sahte (spurious) korelasyonlara aşırı uyum sağladığını ve ardından bu korelasyonlar kırıldığında sistematik olarak yanlış yöne tahmin yaptığını göstermektedir. Bu yönüyle projemiz, Arjovsky ve diğerleri (2019) tarafından incelenen sahte korelasyon tehlikelerine BIST üzerinden kapsamlı bir ampirik örnek sunmaktadır.</w:t>
+        <w:t>Projemizde klasik ML algoritmalarının ve basit teknik göstergelerin dahi rastgele tahmini zorlukla aşabilmesi, EMH'nin zayıf formda geçerliliğini desteklemektedir. Ancak derin öğrenme modellerinin şok dönemlerinde rastgele tahminden belirgin şekilde daha kötü performans sergilemesi (~%40 doğruluk), EMH çerçevesinde açıklanamayan yeni bir anomali ortaya koymaktadır. Bu anti-prediktif davranış, EMH'nin kırılmasından ziyade, modellerin sahte korelasyonlara aşırı uyum sağladığını ve ardından bu korelasyonlar kırıldığında sistematik olarak yanlış yöne tahmin yaptığını göstermektedir.</w:t>
       </w:r>
     </w:p>
     <w:p/>
@@ -330,7 +557,7 @@
         <w:pStyle w:val="Heading2"/>
       </w:pPr>
       <w:r>
-        <w:t>2.6. Pencere Uzunluğu ve Temporal Çözünürlük</w:t>
+        <w:t>2.9. Gürültü Tüccarı Riski ve Spekülatif Piyasa Dinamikleri</w:t>
       </w:r>
     </w:p>
     <w:p/>
@@ -339,25 +566,25 @@
         <w:ind w:firstLine="425"/>
       </w:pPr>
       <w:r>
-        <w:t>Projemizin IN_LEN (giriş penceresi uzunluğu) ablasyon testleri, literatürde az tartışılmış bir konuya yeni kanıtlar sunmaktadır. IN_LEN = 2 (son 2 gün) ve IN_LEN = 5 (son 5 gün) değerlerinde modelin 15/15 konfigürasyonda sistematik olarak anti-prediktif davranış sergilediği, ancak IN_LEN = 10'a (son 10 gün) çıkıldığında bu anomalinin tamamen ortadan kalktığı gösterilmiştir (0/15 anti-prediktif). Bu bulgu, kısa pencereli modellerin günlük mikro-gürültüden daha fazla etkilendiğini ve yeterli temporal bağlam sağlandığında modelin daha sağlam (robust) hâle geldiğini kanıtlamaktadır. Lütkepohl (2005) tarafından tartışılan zaman serisi modellemesinde pencere uzunluğu seçiminin kritikliği, projemizin sonuçlarıyla derin öğrenme bağlamında deneysel olarak pekiştirilmektedir.</w:t>
+        <w:t>De Long ve diğerleri (1990) tarafından tanımlanan "Gürültü Tüccarı Riski (Noise Trader Risk)", perakende yatırımcıların aşırı spekülatif işlemlerinin fiyatların temel değerlerden sapmasına yol açtığını belirtir. Bu risk, geçici ama şiddetli anomalilere neden olur.</w:t>
       </w:r>
     </w:p>
     <w:p/>
     <w:p>
       <w:pPr>
-        <w:pStyle w:val="Heading2"/>
+        <w:ind w:firstLine="425"/>
       </w:pPr>
       <w:r>
-        <w:t>2.7. Walk-Forward Doğrulama ve Dönemsel Etki</w:t>
+        <w:t>BIST'te perakende yatırımcı oranının kurumsal piyasalara kıyasla oldukça yüksek olması, bu riskin etkisini artırmaktadır. Projemizde SASA ve HEKTS hisselerinde — Borsa İstanbul'un tarihsel olarak en yüksek spekülatif perakende hücumuna uğrayan hisseleri — BiLSTM modelinin %100 oranında (15/15 konfigürasyon) anti-prediktif çöküş yaşaması, De Long'un teorisinin makine öğrenmesi üzerindeki yıkıcı etkisini ampirik olarak ispatlamaktadır (bireysel p &lt; 0.0001; Bonferroni-düzeltilmiş p = 0.00012).</w:t>
       </w:r>
     </w:p>
     <w:p/>
     <w:p>
       <w:pPr>
-        <w:ind w:firstLine="425"/>
+        <w:pStyle w:val="Heading2"/>
       </w:pPr>
       <w:r>
-        <w:t>Zaman serisi analizlerinde standart k-fold çapraz doğrulamanın veri sızıntısına (data leakage) yol açtığı bilinmektedir (Torgo ve Mozetic, 2020). Projemizde uygulanan ileriye dönük (7-fold Walk-Forward v2) doğrulama metodu, literatürün bu katı kuralına uygun inşa edilmiştir. Düzeltilmiş versiyonda (v2) validasyon verisi eklenerek erken durdurma (early stopping) mekanizmasının doğru çalışması sağlanmıştır.</w:t>
+        <w:t>2.10. Pencere Uzunluğu ve Temporal Çözünürlük</w:t>
       </w:r>
     </w:p>
     <w:p/>
@@ -366,66 +593,62 @@
         <w:ind w:firstLine="425"/>
       </w:pPr>
       <w:r>
-        <w:t>7-fold Walk-Forward v2 analizinde, 6 mimari × 3 seed = 18 koşu/fold düzeniyle, anti-prediktif davranışın dönemsel bir örüntü izlediği tespit edilmiştir:</w:t>
-      </w:r>
-    </w:p>
-    <w:p>
-      <w:pPr>
-        <w:pStyle w:val="ListBullet"/>
-      </w:pPr>
-      <w:r>
-        <w:t>Fold 2 (2020 — COVID-19 krizi): 18/18 koşuda anti-prediktif → makro şok tetikleyici</w:t>
-      </w:r>
-    </w:p>
-    <w:p>
-      <w:pPr>
-        <w:pStyle w:val="ListBullet"/>
-      </w:pPr>
-      <w:r>
-        <w:t>Fold 3 (2020-21 — Toparlanma): 18/18 koşuda anti-prediktif → şokun devam etkisi</w:t>
-      </w:r>
-    </w:p>
-    <w:p>
-      <w:pPr>
-        <w:pStyle w:val="ListBullet"/>
-      </w:pPr>
-      <w:r>
-        <w:t>Fold 6-7 (2023-25 — Kur şoku ve enflasyon): 14-8/18 koşuda tetikleniyor</w:t>
-      </w:r>
-    </w:p>
-    <w:p>
-      <w:pPr>
-        <w:pStyle w:val="ListBullet"/>
-      </w:pPr>
-      <w:r>
-        <w:t>Fold 1, 4, 5 (Normal dönemler): 0/18 anti-prediktif → model sağlıklı çalışıyor</w:t>
+        <w:t>Zaman serisi modellemesinde pencere uzunluğu seçiminin kritikliği Lütkepohl (2005) tarafından tartışılmıştır. Projemizin IN_LEN ablasyon testleri, bu konuya yeni ve önemli kanıtlar sunmaktadır:</w:t>
       </w:r>
     </w:p>
     <w:p/>
     <w:p>
       <w:pPr>
-        <w:ind w:firstLine="425"/>
+        <w:ind w:left="567"/>
       </w:pPr>
       <w:r>
-        <w:t>Bu dönemsel harita, hataların yazılımsal değil, rejim-bağımlı (regime-dependent) bir kavram kaymasından kaynaklandığını akademik olarak ispatlamaktadır.</w:t>
+        <w:rPr>
+          <w:rFonts w:ascii="Consolas" w:hAnsi="Consolas"/>
+          <w:sz w:val="16"/>
+        </w:rPr>
+        <w:t>IN_LEN = 2:  Model Acc = %39.6,  Flip Acc = %60.4,  Anti-Pred = 15/15</w:t>
+      </w:r>
+    </w:p>
+    <w:p>
+      <w:pPr>
+        <w:ind w:left="567"/>
+      </w:pPr>
+      <w:r>
+        <w:rPr>
+          <w:rFonts w:ascii="Consolas" w:hAnsi="Consolas"/>
+          <w:sz w:val="16"/>
+        </w:rPr>
+        <w:t>IN_LEN = 5:  Model Acc = %45.3,  Flip Acc = %54.7,  Anti-Pred = 15/15</w:t>
+      </w:r>
+    </w:p>
+    <w:p>
+      <w:pPr>
+        <w:ind w:left="567"/>
+      </w:pPr>
+      <w:r>
+        <w:rPr>
+          <w:rFonts w:ascii="Consolas" w:hAnsi="Consolas"/>
+          <w:sz w:val="16"/>
+        </w:rPr>
+        <w:t>IN_LEN = 10: Model Acc = %52.9,  Flip Acc = %47.1,  Anti-Pred = 0/15</w:t>
       </w:r>
     </w:p>
     <w:p/>
     <w:p>
       <w:pPr>
-        <w:pStyle w:val="Heading2"/>
+        <w:ind w:firstLine="425"/>
       </w:pPr>
       <w:r>
-        <w:t>2.8. Gürültü Tüccarı Riski ve Spekülatif Piyasa Dinamikleri</w:t>
+        <w:t>Kısa pencereli (IN_LEN ≤ 5) modellerin günlük mikro-gürültüden daha fazla etkilendiği ve yeterli temporal bağlam sağlandığında (IN_LEN = 10) modelin anti-prediktif davranıştan tamamen kurtulduğu gösterilmiştir. Bu bulgu, pencere uzunluğunun sadece bir hiperparametre değil, anti-prediktif davranışın doğrudan tetikleyicisi olduğunu ortaya koymaktadır.</w:t>
       </w:r>
     </w:p>
     <w:p/>
     <w:p>
       <w:pPr>
-        <w:ind w:firstLine="425"/>
+        <w:pStyle w:val="Heading2"/>
       </w:pPr>
       <w:r>
-        <w:t>Davranışsal finans ve piyasa mikroyapısı literatüründe, perakende (küçük) yatırımcıların aşırı spekülatif işlemleri "Gürültü Tüccarı Riski (Noise Trader Risk)" (De Long ve diğerleri, 1990) olarak tanımlanır. Bu risk, fiyatların temel değerlerden sapmasına ve geçici ama şiddetli anomalilere yol açar.</w:t>
+        <w:t>2.11. Walk-Forward Doğrulama ve Veri Sızıntısı Riskleri</w:t>
       </w:r>
     </w:p>
     <w:p/>
@@ -434,7 +657,7 @@
         <w:ind w:firstLine="425"/>
       </w:pPr>
       <w:r>
-        <w:t>Projemizde gerçekleştirilen genişletilmiş 11 hisselik nihai testlerde, Borsa İstanbul'un tarihsel olarak en yüksek spekülatif perakende hücumuna uğrayan SASA ve HEKTS hisselerinde BiLSTM modelinin %100 oranında (15/15 konfigürasyon) anti-prediktif çöküş yaşaması, De Long'un teorisinin makine öğrenmesi algoritmaları üzerindeki yıkıcı etkisini ampirik olarak ispatlamaktadır. Her iki hisse için binom testi sonuçları istatistiksel olarak son derece anlamlıdır (bireysel p &lt; 0.0001; Bonferroni düzeltmeli p = 0.00012).</w:t>
+        <w:t>Zaman serisi analizlerinde standart k-fold çapraz doğrulamanın veri sızıntısına yol açtığı bilinmektedir. López de Prado (2018) "Advances in Financial Machine Learning" kitabında Purged K-Fold ve Embargoing yöntemlerini önererek, finansal zaman serilerinde sızıntıyı katı biçimde ortadan kaldırmayı amaçlamıştır.</w:t>
       </w:r>
     </w:p>
     <w:p/>
@@ -443,34 +666,34 @@
         <w:ind w:firstLine="425"/>
       </w:pPr>
       <w:r>
-        <w:t>Model, rasyonel piyasa verisi yerine gürültü tüccarlarının yarattığı suni fiyatlamayı öğrenmeye çalışırken kavram kayması (concept drift) yaşayarak tamamen tersine çalışmaya zorlanmıştır. Bu bulgu, algoritmik ticaret sistemlerinin gelişmekte olan piyasalarda "gürültü öğrenme riski" taşıdığını somut verilerle ortaya koymaktadır.</w:t>
+        <w:t>Projemizde uygulanan 7-fold Walk-Forward v2 doğrulama metodu, bu katı kurallara uygun inşa edilmiştir. Düzeltilmiş versiyonda (v2) validasyon verisi (val_data) eklenerek erken durdurma (early stopping) mekanizmasının doğru çalışması sağlanmıştır. v1'deki validasyon eksikliğinin tespiti ve düzeltilmesi, projemizin metodolojik dürüstlüğünün önemli bir göstergesidir.</w:t>
       </w:r>
     </w:p>
     <w:p/>
     <w:p>
       <w:pPr>
-        <w:pStyle w:val="Heading2"/>
+        <w:ind w:firstLine="425"/>
       </w:pPr>
       <w:r>
-        <w:t>2.9. Seçici Tahmin (Selective Prediction) ve Güvenilirlik</w:t>
+        <w:t>Son dönem replikasyon çalışmaları (2023-2025), raporlanan ML başarılarının bir kısmının look-ahead bias içerdiğini ortaya koymuştur. Bu hatalar düzeltildiğinde, algılanan tahmin üstünlüğü genellikle kaybolmakta, bazen rastgele tahminden daha kötü performansa dönüşmektedir. Bu bulgular, projemizin anti-prediktif tespitlerinin metodolojik titizlikle yapılmasının önemini vurgulamaktadır.</w:t>
       </w:r>
     </w:p>
     <w:p/>
     <w:p>
       <w:pPr>
-        <w:ind w:firstLine="425"/>
+        <w:pStyle w:val="Heading2"/>
       </w:pPr>
       <w:r>
-        <w:t>Modellerin güvenilirliği, belirsizliğin yüksek olduğu durumlarda tahmin yapmaktan kaçınabilmesiyle (abstain) de ölçülür. Geifman ve El-Yaniv (2017) tarafından geliştirilen seçici tahmin (selective prediction) teorisi, Kapsam-Doğruluk (Coverage-Accuracy tradeoff) optimizasyonunu zorunlu kılar. Projemizin gelecek çalışmalarında yer alan "Selective Abstain" entegrasyonu, literatürdeki bu savunma mekanizmasını, makroekonomik kırılmalar altında çalışan finansal ağlara uyarlamayı hedeflemektedir.</w:t>
+        <w:t>2.12. Seçici Tahmin (Selective Prediction) ve Model Güvenilirliği</w:t>
       </w:r>
     </w:p>
     <w:p/>
     <w:p>
       <w:pPr>
-        <w:pStyle w:val="Heading2"/>
+        <w:ind w:firstLine="425"/>
       </w:pPr>
       <w:r>
-        <w:t>2.10. Özgün Katkılar</w:t>
+        <w:t>Geifman ve El-Yaniv (2017) tarafından geliştirilen seçici tahmin teorisi, modellerin belirsizliğin yüksek olduğu durumlarda tahmin yapmaktan kaçınabilmesini (abstain) önerir. Kapsam-Doğruluk (Coverage-Accuracy tradeoff) optimizasyonu, özellikle yüksek riskli finansal kararlar için kritik öneme sahiptir.</w:t>
       </w:r>
     </w:p>
     <w:p/>
@@ -479,7 +702,79 @@
         <w:ind w:firstLine="425"/>
       </w:pPr>
       <w:r>
-        <w:t>Projemiz, yukarıda özetlenen 10 farklı literatür akımını tek bir çerçevede birleştirerek şu özgün katkıları sunmaktadır:</w:t>
+        <w:t>Projemizin gelecek çalışmalarında yer alan "Selective Abstain" entegrasyonu, bu savunma mekanizmasını makroekonomik kırılmalar altında çalışan finansal ağlara uyarlamayı hedeflemektedir. Model, tahmininin güven düzeyi belirli bir eşiğin altına düştüğünde otomatik olarak işlem yapmayı durduracaktır (Safe Harbor).</w:t>
+      </w:r>
+    </w:p>
+    <w:p/>
+    <w:p>
+      <w:pPr>
+        <w:pStyle w:val="Heading2"/>
+      </w:pPr>
+      <w:r>
+        <w:t>2.13. Açıklanabilirlik (XAI) ve "Kara Kutu" Eleştirisi</w:t>
+      </w:r>
+    </w:p>
+    <w:p/>
+    <w:p>
+      <w:pPr>
+        <w:ind w:firstLine="425"/>
+      </w:pPr>
+      <w:r>
+        <w:t>Yapay zeka modellerinin açıklanabilirliği (Explainable AI — XAI), 2023-2025 döneminde artan bir akademik ilgi görmüştür. Özellikle finansal uygulamalarda, modellerin sadece doğru değil aynı zamanda yorumlanabilir olması talep edilmektedir. "Kara kutu" eleştirisi, yatırımcıların ve düzenleyicilerin modelin neden belirli bir tahmin yaptığını anlayamamasından kaynaklanmaktadır.</w:t>
+      </w:r>
+    </w:p>
+    <w:p/>
+    <w:p>
+      <w:pPr>
+        <w:ind w:firstLine="425"/>
+      </w:pPr>
+      <w:r>
+        <w:t>Projemiz bu bağlamda güçlü bir konuma sahiptir: "neden başarısız?" sorusunu yanıtlayarak, anti-prediktif davranışın mekanizmasını (hangi sektör, hangi dönem, hangi değişken, hangi pencere uzunluğu) şeffaf biçimde ortaya koymaktadır. Bu "teşhis odaklı" yaklaşım, geleneksel "doğruluk odaklı" yaklaşımın ötesine geçmektedir.</w:t>
+      </w:r>
+    </w:p>
+    <w:p/>
+    <w:p>
+      <w:pPr>
+        <w:pStyle w:val="Heading2"/>
+      </w:pPr>
+      <w:r>
+        <w:t>2.14. Sahte Öngörülebilirlik ve Falsifikasyon Testleri</w:t>
+      </w:r>
+    </w:p>
+    <w:p/>
+    <w:p>
+      <w:pPr>
+        <w:ind w:firstLine="425"/>
+      </w:pPr>
+      <w:r>
+        <w:t>2026 yılında yayımlanan "Spurious Predictability in Financial Machine Learning" çalışması, tahmin iş akışlarını sentetik referans noktalarına karşı değerlendiren falsifikasyon testleri sunmaktadır. Bu yaklaşım, gerçek piyasa yapısını "metodolojik artefakt"lardan ayırmayı hedefler.</w:t>
+      </w:r>
+    </w:p>
+    <w:p/>
+    <w:p>
+      <w:pPr>
+        <w:ind w:firstLine="425"/>
+      </w:pPr>
+      <w:r>
+        <w:t>Projemiz, falsifikasyon prensibini doğrudan uygulamıştır: "Anti-prediktif davranış gerçek mi, yoksa sadece THYAO'ya özgü mü?" sorusunu yanıtlamak için 11 farklı BIST hissesinde 165 konfigürasyonluk kapsamlı bir stres testi gerçekleştirilmiştir. Sonuçlar, anomalinin belirli bir hisseye değil, belirli sektörel ve makroekonomik koşullara bağlı olduğunu kesin olarak kanıtlamıştır.</w:t>
+      </w:r>
+    </w:p>
+    <w:p/>
+    <w:p>
+      <w:pPr>
+        <w:pStyle w:val="Heading2"/>
+      </w:pPr>
+      <w:r>
+        <w:t>2.15. Özgün Katkılar</w:t>
+      </w:r>
+    </w:p>
+    <w:p/>
+    <w:p>
+      <w:pPr>
+        <w:ind w:firstLine="425"/>
+      </w:pPr>
+      <w:r>
+        <w:t>Projemiz, yukarıda özetlenen geniş literatür taramasını tek bir çerçevede birleştirerek şu özgün katkıları sunmaktadır:</w:t>
       </w:r>
     </w:p>
     <w:p>
@@ -487,7 +782,7 @@
         <w:pStyle w:val="ListBullet"/>
       </w:pPr>
       <w:r>
-        <w:t>Anti-prediktif davranışın sistematik olarak belgelenmesi (700+ konfigürasyon, 6 mimari, 27 varlık)</w:t>
+        <w:t>Anti-prediktif davranışın sistematik olarak belgelenmesi (700+ konfigürasyon, 6 mimari, 27 varlık, 130 CSV)</w:t>
       </w:r>
     </w:p>
     <w:p>
@@ -495,7 +790,7 @@
         <w:pStyle w:val="ListBullet"/>
       </w:pPr>
       <w:r>
-        <w:t>Sektörel ayrışmanın kanıtlanması (havacılık/spekülatif vs bankacılık/kurumsal)</w:t>
+        <w:t>Sektörel ayrışmanın kanıtlanması (havacılık/spekülatif vs bankacılık/kurumsal, p &lt; 0.0001)</w:t>
       </w:r>
     </w:p>
     <w:p>
@@ -503,7 +798,7 @@
         <w:pStyle w:val="ListBullet"/>
       </w:pPr>
       <w:r>
-        <w:t>Pencere uzunluğu etkisinin keşfedilmesi (IN_LEN ≤ 5 tetikler, IN_LEN = 10 kaybeder)</w:t>
+        <w:t>Pencere uzunluğu etkisinin keşfedilmesi (IN_LEN ≤ 5 tetikler, IN_LEN = 10 ortadan kaldırır)</w:t>
       </w:r>
     </w:p>
     <w:p>
@@ -530,693 +825,20 @@
         <w:t>Çapraz piyasa karşılaştırması (BIST anti-prediktif, NASDAQ normal)</w:t>
       </w:r>
     </w:p>
-    <w:p/>
     <w:p>
       <w:pPr>
-        <w:jc w:val="center"/>
+        <w:pStyle w:val="ListBullet"/>
       </w:pPr>
       <w:r>
-        <w:rPr>
-          <w:b/>
-          <w:sz w:val="18"/>
-        </w:rPr>
-        <w:t>Tablo 1: 11 BIST Hissesinde Anti-Prediktif Davranış Analizi</w:t>
+        <w:t>MC tuzağının Türk literatüründe ilk kez belgelenmesi (700+ koşuda MC = 0)</w:t>
       </w:r>
     </w:p>
-    <w:tbl>
-      <w:tblPr>
-        <w:tblStyle w:val="LightShading-Accent1"/>
-        <w:tblW w:type="auto" w:w="0"/>
-        <w:jc w:val="center"/>
-        <w:tblLook w:firstColumn="1" w:firstRow="1" w:lastColumn="0" w:lastRow="0" w:noHBand="0" w:noVBand="1" w:val="04A0"/>
-      </w:tblPr>
-      <w:tblGrid>
-        <w:gridCol w:w="2280"/>
-        <w:gridCol w:w="2280"/>
-        <w:gridCol w:w="2280"/>
-        <w:gridCol w:w="2280"/>
-      </w:tblGrid>
-      <w:tr>
-        <w:tc>
-          <w:tcPr>
-            <w:tcW w:type="dxa" w:w="2280"/>
-          </w:tcPr>
-          <w:p>
-            <w:r>
-              <w:rPr>
-                <w:b/>
-                <w:sz w:val="16"/>
-              </w:rPr>
-              <w:t>Hisse</w:t>
-            </w:r>
-          </w:p>
-        </w:tc>
-        <w:tc>
-          <w:tcPr>
-            <w:tcW w:type="dxa" w:w="2280"/>
-          </w:tcPr>
-          <w:p>
-            <w:r>
-              <w:rPr>
-                <w:b/>
-                <w:sz w:val="16"/>
-              </w:rPr>
-              <w:t>Sektör</w:t>
-            </w:r>
-          </w:p>
-        </w:tc>
-        <w:tc>
-          <w:tcPr>
-            <w:tcW w:type="dxa" w:w="2280"/>
-          </w:tcPr>
-          <w:p>
-            <w:r>
-              <w:rPr>
-                <w:b/>
-                <w:sz w:val="16"/>
-              </w:rPr>
-              <w:t>Anti-Prediktif</w:t>
-            </w:r>
-          </w:p>
-        </w:tc>
-        <w:tc>
-          <w:tcPr>
-            <w:tcW w:type="dxa" w:w="2280"/>
-          </w:tcPr>
-          <w:p>
-            <w:r>
-              <w:rPr>
-                <w:b/>
-                <w:sz w:val="16"/>
-              </w:rPr>
-              <w:t>p-değeri</w:t>
-            </w:r>
-          </w:p>
-        </w:tc>
-      </w:tr>
-      <w:tr>
-        <w:tc>
-          <w:tcPr>
-            <w:tcW w:type="dxa" w:w="2280"/>
-          </w:tcPr>
-          <w:p>
-            <w:r>
-              <w:rPr>
-                <w:sz w:val="16"/>
-              </w:rPr>
-              <w:t>THYAO</w:t>
-            </w:r>
-          </w:p>
-        </w:tc>
-        <w:tc>
-          <w:tcPr>
-            <w:tcW w:type="dxa" w:w="2280"/>
-          </w:tcPr>
-          <w:p>
-            <w:r>
-              <w:rPr>
-                <w:sz w:val="16"/>
-              </w:rPr>
-              <w:t>Havacılık</w:t>
-            </w:r>
-          </w:p>
-        </w:tc>
-        <w:tc>
-          <w:tcPr>
-            <w:tcW w:type="dxa" w:w="2280"/>
-          </w:tcPr>
-          <w:p>
-            <w:r>
-              <w:rPr>
-                <w:sz w:val="16"/>
-              </w:rPr>
-              <w:t>15/15 (%100)</w:t>
-            </w:r>
-          </w:p>
-        </w:tc>
-        <w:tc>
-          <w:tcPr>
-            <w:tcW w:type="dxa" w:w="2280"/>
-          </w:tcPr>
-          <w:p>
-            <w:r>
-              <w:rPr>
-                <w:sz w:val="16"/>
-              </w:rPr>
-              <w:t>&lt; 0.0001</w:t>
-            </w:r>
-          </w:p>
-        </w:tc>
-      </w:tr>
-      <w:tr>
-        <w:tc>
-          <w:tcPr>
-            <w:tcW w:type="dxa" w:w="2280"/>
-          </w:tcPr>
-          <w:p>
-            <w:r>
-              <w:rPr>
-                <w:sz w:val="16"/>
-              </w:rPr>
-              <w:t>PGSUS</w:t>
-            </w:r>
-          </w:p>
-        </w:tc>
-        <w:tc>
-          <w:tcPr>
-            <w:tcW w:type="dxa" w:w="2280"/>
-          </w:tcPr>
-          <w:p>
-            <w:r>
-              <w:rPr>
-                <w:sz w:val="16"/>
-              </w:rPr>
-              <w:t>Havacılık</w:t>
-            </w:r>
-          </w:p>
-        </w:tc>
-        <w:tc>
-          <w:tcPr>
-            <w:tcW w:type="dxa" w:w="2280"/>
-          </w:tcPr>
-          <w:p>
-            <w:r>
-              <w:rPr>
-                <w:sz w:val="16"/>
-              </w:rPr>
-              <w:t>15/15 (%100)</w:t>
-            </w:r>
-          </w:p>
-        </w:tc>
-        <w:tc>
-          <w:tcPr>
-            <w:tcW w:type="dxa" w:w="2280"/>
-          </w:tcPr>
-          <w:p>
-            <w:r>
-              <w:rPr>
-                <w:sz w:val="16"/>
-              </w:rPr>
-              <w:t>&lt; 0.0001</w:t>
-            </w:r>
-          </w:p>
-        </w:tc>
-      </w:tr>
-      <w:tr>
-        <w:tc>
-          <w:tcPr>
-            <w:tcW w:type="dxa" w:w="2280"/>
-          </w:tcPr>
-          <w:p>
-            <w:r>
-              <w:rPr>
-                <w:sz w:val="16"/>
-              </w:rPr>
-              <w:t>HEKTS</w:t>
-            </w:r>
-          </w:p>
-        </w:tc>
-        <w:tc>
-          <w:tcPr>
-            <w:tcW w:type="dxa" w:w="2280"/>
-          </w:tcPr>
-          <w:p>
-            <w:r>
-              <w:rPr>
-                <w:sz w:val="16"/>
-              </w:rPr>
-              <w:t>Spekülatif</w:t>
-            </w:r>
-          </w:p>
-        </w:tc>
-        <w:tc>
-          <w:tcPr>
-            <w:tcW w:type="dxa" w:w="2280"/>
-          </w:tcPr>
-          <w:p>
-            <w:r>
-              <w:rPr>
-                <w:sz w:val="16"/>
-              </w:rPr>
-              <w:t>15/15 (%100)</w:t>
-            </w:r>
-          </w:p>
-        </w:tc>
-        <w:tc>
-          <w:tcPr>
-            <w:tcW w:type="dxa" w:w="2280"/>
-          </w:tcPr>
-          <w:p>
-            <w:r>
-              <w:rPr>
-                <w:sz w:val="16"/>
-              </w:rPr>
-              <w:t>&lt; 0.0001</w:t>
-            </w:r>
-          </w:p>
-        </w:tc>
-      </w:tr>
-      <w:tr>
-        <w:tc>
-          <w:tcPr>
-            <w:tcW w:type="dxa" w:w="2280"/>
-          </w:tcPr>
-          <w:p>
-            <w:r>
-              <w:rPr>
-                <w:sz w:val="16"/>
-              </w:rPr>
-              <w:t>SASA</w:t>
-            </w:r>
-          </w:p>
-        </w:tc>
-        <w:tc>
-          <w:tcPr>
-            <w:tcW w:type="dxa" w:w="2280"/>
-          </w:tcPr>
-          <w:p>
-            <w:r>
-              <w:rPr>
-                <w:sz w:val="16"/>
-              </w:rPr>
-              <w:t>Spekülatif</w:t>
-            </w:r>
-          </w:p>
-        </w:tc>
-        <w:tc>
-          <w:tcPr>
-            <w:tcW w:type="dxa" w:w="2280"/>
-          </w:tcPr>
-          <w:p>
-            <w:r>
-              <w:rPr>
-                <w:sz w:val="16"/>
-              </w:rPr>
-              <w:t>15/15 (%100)</w:t>
-            </w:r>
-          </w:p>
-        </w:tc>
-        <w:tc>
-          <w:tcPr>
-            <w:tcW w:type="dxa" w:w="2280"/>
-          </w:tcPr>
-          <w:p>
-            <w:r>
-              <w:rPr>
-                <w:sz w:val="16"/>
-              </w:rPr>
-              <w:t>&lt; 0.0001</w:t>
-            </w:r>
-          </w:p>
-        </w:tc>
-      </w:tr>
-      <w:tr>
-        <w:tc>
-          <w:tcPr>
-            <w:tcW w:type="dxa" w:w="2280"/>
-          </w:tcPr>
-          <w:p>
-            <w:r>
-              <w:rPr>
-                <w:sz w:val="16"/>
-              </w:rPr>
-              <w:t>KRDMD</w:t>
-            </w:r>
-          </w:p>
-        </w:tc>
-        <w:tc>
-          <w:tcPr>
-            <w:tcW w:type="dxa" w:w="2280"/>
-          </w:tcPr>
-          <w:p>
-            <w:r>
-              <w:rPr>
-                <w:sz w:val="16"/>
-              </w:rPr>
-              <w:t>Emtia/Demir-Çelik</w:t>
-            </w:r>
-          </w:p>
-        </w:tc>
-        <w:tc>
-          <w:tcPr>
-            <w:tcW w:type="dxa" w:w="2280"/>
-          </w:tcPr>
-          <w:p>
-            <w:r>
-              <w:rPr>
-                <w:sz w:val="16"/>
-              </w:rPr>
-              <w:t>13/15 (%87)</w:t>
-            </w:r>
-          </w:p>
-        </w:tc>
-        <w:tc>
-          <w:tcPr>
-            <w:tcW w:type="dxa" w:w="2280"/>
-          </w:tcPr>
-          <w:p>
-            <w:r>
-              <w:rPr>
-                <w:sz w:val="16"/>
-              </w:rPr>
-              <w:t>= 0.0037</w:t>
-            </w:r>
-          </w:p>
-        </w:tc>
-      </w:tr>
-      <w:tr>
-        <w:tc>
-          <w:tcPr>
-            <w:tcW w:type="dxa" w:w="2280"/>
-          </w:tcPr>
-          <w:p>
-            <w:r>
-              <w:rPr>
-                <w:sz w:val="16"/>
-              </w:rPr>
-              <w:t>FROTO</w:t>
-            </w:r>
-          </w:p>
-        </w:tc>
-        <w:tc>
-          <w:tcPr>
-            <w:tcW w:type="dxa" w:w="2280"/>
-          </w:tcPr>
-          <w:p>
-            <w:r>
-              <w:rPr>
-                <w:sz w:val="16"/>
-              </w:rPr>
-              <w:t>Otomotiv</w:t>
-            </w:r>
-          </w:p>
-        </w:tc>
-        <w:tc>
-          <w:tcPr>
-            <w:tcW w:type="dxa" w:w="2280"/>
-          </w:tcPr>
-          <w:p>
-            <w:r>
-              <w:rPr>
-                <w:sz w:val="16"/>
-              </w:rPr>
-              <w:t>Normal</w:t>
-            </w:r>
-          </w:p>
-        </w:tc>
-        <w:tc>
-          <w:tcPr>
-            <w:tcW w:type="dxa" w:w="2280"/>
-          </w:tcPr>
-          <w:p>
-            <w:r>
-              <w:rPr>
-                <w:sz w:val="16"/>
-              </w:rPr>
-              <w:t>—</w:t>
-            </w:r>
-          </w:p>
-        </w:tc>
-      </w:tr>
-      <w:tr>
-        <w:tc>
-          <w:tcPr>
-            <w:tcW w:type="dxa" w:w="2280"/>
-          </w:tcPr>
-          <w:p>
-            <w:r>
-              <w:rPr>
-                <w:sz w:val="16"/>
-              </w:rPr>
-              <w:t>YKBNK</w:t>
-            </w:r>
-          </w:p>
-        </w:tc>
-        <w:tc>
-          <w:tcPr>
-            <w:tcW w:type="dxa" w:w="2280"/>
-          </w:tcPr>
-          <w:p>
-            <w:r>
-              <w:rPr>
-                <w:sz w:val="16"/>
-              </w:rPr>
-              <w:t>Bankacılık</w:t>
-            </w:r>
-          </w:p>
-        </w:tc>
-        <w:tc>
-          <w:tcPr>
-            <w:tcW w:type="dxa" w:w="2280"/>
-          </w:tcPr>
-          <w:p>
-            <w:r>
-              <w:rPr>
-                <w:sz w:val="16"/>
-              </w:rPr>
-              <w:t>Normal</w:t>
-            </w:r>
-          </w:p>
-        </w:tc>
-        <w:tc>
-          <w:tcPr>
-            <w:tcW w:type="dxa" w:w="2280"/>
-          </w:tcPr>
-          <w:p>
-            <w:r>
-              <w:rPr>
-                <w:sz w:val="16"/>
-              </w:rPr>
-              <w:t>—</w:t>
-            </w:r>
-          </w:p>
-        </w:tc>
-      </w:tr>
-      <w:tr>
-        <w:tc>
-          <w:tcPr>
-            <w:tcW w:type="dxa" w:w="2280"/>
-          </w:tcPr>
-          <w:p>
-            <w:r>
-              <w:rPr>
-                <w:sz w:val="16"/>
-              </w:rPr>
-              <w:t>DOAS</w:t>
-            </w:r>
-          </w:p>
-        </w:tc>
-        <w:tc>
-          <w:tcPr>
-            <w:tcW w:type="dxa" w:w="2280"/>
-          </w:tcPr>
-          <w:p>
-            <w:r>
-              <w:rPr>
-                <w:sz w:val="16"/>
-              </w:rPr>
-              <w:t>Ticaret</w:t>
-            </w:r>
-          </w:p>
-        </w:tc>
-        <w:tc>
-          <w:tcPr>
-            <w:tcW w:type="dxa" w:w="2280"/>
-          </w:tcPr>
-          <w:p>
-            <w:r>
-              <w:rPr>
-                <w:sz w:val="16"/>
-              </w:rPr>
-              <w:t>Normal</w:t>
-            </w:r>
-          </w:p>
-        </w:tc>
-        <w:tc>
-          <w:tcPr>
-            <w:tcW w:type="dxa" w:w="2280"/>
-          </w:tcPr>
-          <w:p>
-            <w:r>
-              <w:rPr>
-                <w:sz w:val="16"/>
-              </w:rPr>
-              <w:t>—</w:t>
-            </w:r>
-          </w:p>
-        </w:tc>
-      </w:tr>
-      <w:tr>
-        <w:tc>
-          <w:tcPr>
-            <w:tcW w:type="dxa" w:w="2280"/>
-          </w:tcPr>
-          <w:p>
-            <w:r>
-              <w:rPr>
-                <w:sz w:val="16"/>
-              </w:rPr>
-              <w:t>ISCTR</w:t>
-            </w:r>
-          </w:p>
-        </w:tc>
-        <w:tc>
-          <w:tcPr>
-            <w:tcW w:type="dxa" w:w="2280"/>
-          </w:tcPr>
-          <w:p>
-            <w:r>
-              <w:rPr>
-                <w:sz w:val="16"/>
-              </w:rPr>
-              <w:t>Bankacılık</w:t>
-            </w:r>
-          </w:p>
-        </w:tc>
-        <w:tc>
-          <w:tcPr>
-            <w:tcW w:type="dxa" w:w="2280"/>
-          </w:tcPr>
-          <w:p>
-            <w:r>
-              <w:rPr>
-                <w:sz w:val="16"/>
-              </w:rPr>
-              <w:t>Normal</w:t>
-            </w:r>
-          </w:p>
-        </w:tc>
-        <w:tc>
-          <w:tcPr>
-            <w:tcW w:type="dxa" w:w="2280"/>
-          </w:tcPr>
-          <w:p>
-            <w:r>
-              <w:rPr>
-                <w:sz w:val="16"/>
-              </w:rPr>
-              <w:t>—</w:t>
-            </w:r>
-          </w:p>
-        </w:tc>
-      </w:tr>
-      <w:tr>
-        <w:tc>
-          <w:tcPr>
-            <w:tcW w:type="dxa" w:w="2280"/>
-          </w:tcPr>
-          <w:p>
-            <w:r>
-              <w:rPr>
-                <w:sz w:val="16"/>
-              </w:rPr>
-              <w:t>TAVHL</w:t>
-            </w:r>
-          </w:p>
-        </w:tc>
-        <w:tc>
-          <w:tcPr>
-            <w:tcW w:type="dxa" w:w="2280"/>
-          </w:tcPr>
-          <w:p>
-            <w:r>
-              <w:rPr>
-                <w:sz w:val="16"/>
-              </w:rPr>
-              <w:t>Havalimanı</w:t>
-            </w:r>
-          </w:p>
-        </w:tc>
-        <w:tc>
-          <w:tcPr>
-            <w:tcW w:type="dxa" w:w="2280"/>
-          </w:tcPr>
-          <w:p>
-            <w:r>
-              <w:rPr>
-                <w:sz w:val="16"/>
-              </w:rPr>
-              <w:t>Nötr</w:t>
-            </w:r>
-          </w:p>
-        </w:tc>
-        <w:tc>
-          <w:tcPr>
-            <w:tcW w:type="dxa" w:w="2280"/>
-          </w:tcPr>
-          <w:p>
-            <w:r>
-              <w:rPr>
-                <w:sz w:val="16"/>
-              </w:rPr>
-              <w:t>—</w:t>
-            </w:r>
-          </w:p>
-        </w:tc>
-      </w:tr>
-      <w:tr>
-        <w:tc>
-          <w:tcPr>
-            <w:tcW w:type="dxa" w:w="2280"/>
-          </w:tcPr>
-          <w:p>
-            <w:r>
-              <w:rPr>
-                <w:sz w:val="16"/>
-              </w:rPr>
-              <w:t>KOZAL</w:t>
-            </w:r>
-          </w:p>
-        </w:tc>
-        <w:tc>
-          <w:tcPr>
-            <w:tcW w:type="dxa" w:w="2280"/>
-          </w:tcPr>
-          <w:p>
-            <w:r>
-              <w:rPr>
-                <w:sz w:val="16"/>
-              </w:rPr>
-              <w:t>Madencilik</w:t>
-            </w:r>
-          </w:p>
-        </w:tc>
-        <w:tc>
-          <w:tcPr>
-            <w:tcW w:type="dxa" w:w="2280"/>
-          </w:tcPr>
-          <w:p>
-            <w:r>
-              <w:rPr>
-                <w:sz w:val="16"/>
-              </w:rPr>
-              <w:t>Nötr</w:t>
-            </w:r>
-          </w:p>
-        </w:tc>
-        <w:tc>
-          <w:tcPr>
-            <w:tcW w:type="dxa" w:w="2280"/>
-          </w:tcPr>
-          <w:p>
-            <w:r>
-              <w:rPr>
-                <w:sz w:val="16"/>
-              </w:rPr>
-              <w:t>—</w:t>
-            </w:r>
-          </w:p>
-        </w:tc>
-      </w:tr>
-    </w:tbl>
     <w:p>
+      <w:pPr>
+        <w:pStyle w:val="ListBullet"/>
+      </w:pPr>
       <w:r>
-        <w:rPr>
-          <w:b/>
-          <w:i/>
-          <w:sz w:val="16"/>
-        </w:rPr>
-        <w:t>Bonferroni-düzeltilmiş 4 hisse: p = 0.00012</w:t>
+        <w:t>Falsifikasyon testleriyle bulguların sağlamlığının ispatlanması (11 hisselik stres testi)</w:t>
       </w:r>
     </w:p>
     <w:p>
@@ -1238,7 +860,7 @@
         <w:ind w:firstLine="425"/>
       </w:pPr>
       <w:r>
-        <w:t>Her bilimsel araştırma belirli metodolojik ve pratik sınırlar (kısıtlar) içerisinde yürütülür. Projemizin TÜBİTAK 2209-A kapsamında ortaya koyduğu "Derin Öğrenmede Anti-Prediktif Eğilimin Çok Boyutlu Teşhisi" bulgularının akademik şeffaflığa oturması adına, mevcut kısıtlar ve gelecek çalışmalarda hedeflenen iş paketleri aşağıda detaylandırılmıştır:</w:t>
+        <w:t>Her bilimsel araştırma belirli metodolojik ve pratik sınırlar içerisinde yürütülür. Projemizin TÜBİTAK 2209-A kapsamında ortaya koyduğu "Derin Öğrenmede Anti-Prediktif Eğilimin Çok Boyutlu Teşhisi" bulgularının akademik şeffaflığa oturması adına, mevcut kısıtlar ve gelecek çalışmalarda hedeflenen iş paketleri aşağıda detaylandırılmıştır:</w:t>
       </w:r>
     </w:p>
     <w:p/>
@@ -1270,7 +892,7 @@
           <w:rFonts w:ascii="Consolas" w:hAnsi="Consolas"/>
           <w:sz w:val="16"/>
         </w:rPr>
-        <w:t>Hisse         Sektör                Anti-Prediktif   p-değeri</w:t>
+        <w:t>Hisse   Sektör              Anti-Prediktif   p-değeri</w:t>
       </w:r>
     </w:p>
     <w:p>
@@ -1282,7 +904,7 @@
           <w:rFonts w:ascii="Consolas" w:hAnsi="Consolas"/>
           <w:sz w:val="16"/>
         </w:rPr>
-        <w:t>THYAO         Havacılık             15/15 (%100)     &lt; 0.0001</w:t>
+        <w:t>THYAO   Havacılık            15/15 (%100)     &lt; 0.0001</w:t>
       </w:r>
     </w:p>
     <w:p>
@@ -1294,7 +916,7 @@
           <w:rFonts w:ascii="Consolas" w:hAnsi="Consolas"/>
           <w:sz w:val="16"/>
         </w:rPr>
-        <w:t>PGSUS         Havacılık             15/15 (%100)     &lt; 0.0001</w:t>
+        <w:t>PGSUS   Havacılık            15/15 (%100)     &lt; 0.0001</w:t>
       </w:r>
     </w:p>
     <w:p>
@@ -1306,7 +928,7 @@
           <w:rFonts w:ascii="Consolas" w:hAnsi="Consolas"/>
           <w:sz w:val="16"/>
         </w:rPr>
-        <w:t>HEKTS         Spekülatif            15/15 (%100)     &lt; 0.0001</w:t>
+        <w:t>HEKTS   Spekülatif           15/15 (%100)     &lt; 0.0001</w:t>
       </w:r>
     </w:p>
     <w:p>
@@ -1318,7 +940,7 @@
           <w:rFonts w:ascii="Consolas" w:hAnsi="Consolas"/>
           <w:sz w:val="16"/>
         </w:rPr>
-        <w:t>SASA          Spekülatif            15/15 (%100)     &lt; 0.0001</w:t>
+        <w:t>SASA    Spekülatif           15/15 (%100)     &lt; 0.0001</w:t>
       </w:r>
     </w:p>
     <w:p>
@@ -1330,7 +952,7 @@
           <w:rFonts w:ascii="Consolas" w:hAnsi="Consolas"/>
           <w:sz w:val="16"/>
         </w:rPr>
-        <w:t>KRDMD         Emtia/Demir-Çelik    13/15 (%87)      = 0.0037</w:t>
+        <w:t>KRDMD   Emtia/Demir-Çelik   13/15 (%87)      = 0.0037</w:t>
       </w:r>
     </w:p>
     <w:p>
@@ -1342,7 +964,7 @@
           <w:rFonts w:ascii="Consolas" w:hAnsi="Consolas"/>
           <w:sz w:val="16"/>
         </w:rPr>
-        <w:t>FROTO         Otomotiv              Normal           —</w:t>
+        <w:t>FROTO   Otomotiv             Normal           —</w:t>
       </w:r>
     </w:p>
     <w:p>
@@ -1354,7 +976,7 @@
           <w:rFonts w:ascii="Consolas" w:hAnsi="Consolas"/>
           <w:sz w:val="16"/>
         </w:rPr>
-        <w:t>YKBNK         Bankacılık            Normal           —</w:t>
+        <w:t>YKBNK   Bankacılık           Normal           —</w:t>
       </w:r>
     </w:p>
     <w:p>
@@ -1366,7 +988,7 @@
           <w:rFonts w:ascii="Consolas" w:hAnsi="Consolas"/>
           <w:sz w:val="16"/>
         </w:rPr>
-        <w:t>DOAS          Ticaret               Normal           —</w:t>
+        <w:t>DOAS    Ticaret              Normal           —</w:t>
       </w:r>
     </w:p>
     <w:p>
@@ -1378,7 +1000,7 @@
           <w:rFonts w:ascii="Consolas" w:hAnsi="Consolas"/>
           <w:sz w:val="16"/>
         </w:rPr>
-        <w:t>ISCTR         Bankacılık            Normal           —</w:t>
+        <w:t>ISCTR   Bankacılık           Normal           —</w:t>
       </w:r>
     </w:p>
     <w:p>
@@ -1390,7 +1012,7 @@
           <w:rFonts w:ascii="Consolas" w:hAnsi="Consolas"/>
           <w:sz w:val="16"/>
         </w:rPr>
-        <w:t>TAVHL         Havalimanı            Nötr             —</w:t>
+        <w:t>TAVHL   Havalimanı           Nötr             —</w:t>
       </w:r>
     </w:p>
     <w:p>
@@ -1402,7 +1024,7 @@
           <w:rFonts w:ascii="Consolas" w:hAnsi="Consolas"/>
           <w:sz w:val="16"/>
         </w:rPr>
-        <w:t>KOZAL         Madencilik            Nötr             —</w:t>
+        <w:t>KOZAL   Madencilik           Nötr             —</w:t>
       </w:r>
     </w:p>
     <w:p/>
@@ -1415,7 +1037,7 @@
           <w:rFonts w:ascii="Consolas" w:hAnsi="Consolas"/>
           <w:sz w:val="16"/>
         </w:rPr>
-        <w:t>Bonferroni-düzeltilmiş 4 hisse: p = 0.00012 (istatistiksel olarak çok anlamlı)</w:t>
+        <w:t>Bonferroni-düzeltilmiş 4 hisse: p = 0.00012</w:t>
       </w:r>
     </w:p>
     <w:p/>
@@ -1424,7 +1046,91 @@
         <w:ind w:firstLine="425"/>
       </w:pPr>
       <w:r>
-        <w:t>Buna karşılık, kurumsal ve yapısal olarak sağlam hisselerde (FROTO, YKBNK) herhangi bir anti-prediktif çöküş yaşanmaması, sorunun dış şokların kendisinde değil; hissenin piyasa mikroyapısındaki (hacim, spread, spekülatif balon) kırılganlıkta yattığını ispatlamıştır.</w:t>
+        <w:t>Walk-Forward v2'de anti-prediktif davranışın dönemsel haritası:</w:t>
+      </w:r>
+    </w:p>
+    <w:p>
+      <w:pPr>
+        <w:ind w:left="567"/>
+      </w:pPr>
+      <w:r>
+        <w:rPr>
+          <w:rFonts w:ascii="Consolas" w:hAnsi="Consolas"/>
+          <w:sz w:val="16"/>
+        </w:rPr>
+        <w:t>Fold 1 (2019):        0/18 anti-prediktif  → Normal dönem</w:t>
+      </w:r>
+    </w:p>
+    <w:p>
+      <w:pPr>
+        <w:ind w:left="567"/>
+      </w:pPr>
+      <w:r>
+        <w:rPr>
+          <w:rFonts w:ascii="Consolas" w:hAnsi="Consolas"/>
+          <w:sz w:val="16"/>
+        </w:rPr>
+        <w:t>Fold 2 (2020 COVID):  18/18 anti-prediktif → Makro şok tetikleyici</w:t>
+      </w:r>
+    </w:p>
+    <w:p>
+      <w:pPr>
+        <w:ind w:left="567"/>
+      </w:pPr>
+      <w:r>
+        <w:rPr>
+          <w:rFonts w:ascii="Consolas" w:hAnsi="Consolas"/>
+          <w:sz w:val="16"/>
+        </w:rPr>
+        <w:t>Fold 3 (2020-21):     18/18 anti-prediktif → Şokun devam etkisi</w:t>
+      </w:r>
+    </w:p>
+    <w:p>
+      <w:pPr>
+        <w:ind w:left="567"/>
+      </w:pPr>
+      <w:r>
+        <w:rPr>
+          <w:rFonts w:ascii="Consolas" w:hAnsi="Consolas"/>
+          <w:sz w:val="16"/>
+        </w:rPr>
+        <w:t>Fold 4 (2021-22):     0/18 anti-prediktif  → Toparlanma</w:t>
+      </w:r>
+    </w:p>
+    <w:p>
+      <w:pPr>
+        <w:ind w:left="567"/>
+      </w:pPr>
+      <w:r>
+        <w:rPr>
+          <w:rFonts w:ascii="Consolas" w:hAnsi="Consolas"/>
+          <w:sz w:val="16"/>
+        </w:rPr>
+        <w:t>Fold 5 (2022-23):     0/18 anti-prediktif  → Normal dönem</w:t>
+      </w:r>
+    </w:p>
+    <w:p>
+      <w:pPr>
+        <w:ind w:left="567"/>
+      </w:pPr>
+      <w:r>
+        <w:rPr>
+          <w:rFonts w:ascii="Consolas" w:hAnsi="Consolas"/>
+          <w:sz w:val="16"/>
+        </w:rPr>
+        <w:t>Fold 6 (2023-24):     14/18 anti-prediktif → Kur şoku/enflasyon</w:t>
+      </w:r>
+    </w:p>
+    <w:p>
+      <w:pPr>
+        <w:ind w:left="567"/>
+      </w:pPr>
+      <w:r>
+        <w:rPr>
+          <w:rFonts w:ascii="Consolas" w:hAnsi="Consolas"/>
+          <w:sz w:val="16"/>
+        </w:rPr>
+        <w:t>Fold 7 (2024-25):     8/18 anti-prediktif  → Kısmi etki</w:t>
       </w:r>
     </w:p>
     <w:p/>
@@ -1433,16 +1139,20 @@
         <w:ind w:firstLine="425"/>
       </w:pPr>
       <w:r>
-        <w:t>Mevcut Kısıt: Model, hangi dönemin rasyonel piyasa, hangi dönemin spekülatif "gürültü" dönemi olduğunu otomatik (dinamik) olarak tespit edememektedir. Walk-Forward v2 analizinde Fold 2 (COVID) ve Fold 6-7 (kur şoku/enflasyon) dönemleri geriye dönük olarak saptanmıştır, ancak bunu gerçek zamanlı olarak algılayacak bir mekanizma bulunmamaktadır.</w:t>
+        <w:t>Mevcut Kısıt: Model, hangi dönemin rasyonel piyasa, hangi dönemin spekülatif "gürültü" dönemi olduğunu otomatik (dinamik) olarak tespit edememektedir. Yukarıdaki dönemsel harita geriye dönük olarak saptanmıştır; gerçek zamanlı algılama mekanizması bulunmamaktadır.</w:t>
       </w:r>
     </w:p>
     <w:p/>
     <w:p>
       <w:pPr>
-        <w:pStyle w:val="ListBullet"/>
+        <w:ind w:left="567"/>
       </w:pPr>
       <w:r>
-        <w:t>Gelecek Çalışmalar (İş Paketi 1): Modelin spekülatif çöküş yaşadığı hisselerdeki hacim derinliği ve mikro-volatilite dinamikleri matematiksel olarak modellenecektir. "Gürültü Tüccarı (Noise Trader)" rejimlerini otomatik olarak algılayıp modeli o dönemlerde uyku moduna alacak bir makro-duyarlı (macro-aware) Rejim Değişim (Regime-Switching) algoritması tasarlanması planlanmaktadır. Hamilton (1989) tarafından geliştirilen Markov Regime-Switching modelleri bu entegrasyonun teorik temeli olacaktır.</w:t>
+        <w:rPr>
+          <w:rFonts w:ascii="Consolas" w:hAnsi="Consolas"/>
+          <w:sz w:val="16"/>
+        </w:rPr>
+        <w:t>Gelecek Çalışmalar (İş Paketi 1): Hamilton (1989) Markov Regime-Switching modelleri temelinde, modelin spekülatif çöküş yaşadığı dönemleri otomatik olarak algılayıp uyku moduna alacak bir makro-duyarlı rejim değişim algoritması tasarlanacaktır.</w:t>
       </w:r>
     </w:p>
     <w:p/>
@@ -1452,7 +1162,7 @@
         <w:pStyle w:val="Heading2"/>
       </w:pPr>
       <w:r>
-        <w:t>2. Statik Eşik Değerleri ve Coverage–Accuracy (Kapsam–Doğruluk) İkilemi</w:t>
+        <w:t>2. Anti-Prediktif Davranışın Mekanizmasının Tam Aydınlatılamaması</w:t>
       </w:r>
     </w:p>
     <w:p/>
@@ -1461,16 +1171,20 @@
         <w:ind w:firstLine="425"/>
       </w:pPr>
       <w:r>
-        <w:t>Mevcut mimarilerde model, piyasa ne kadar gürültülü veya istikrarsız olursa olsun statik karar sınırlarıyla (threshold = 0.50) "Yön" üretmeye zorlanmaktadır. Projede gerçekleştirilen Threshold Grid analizinde 0.30-0.70 aralığında eşik optimizasyonu yapılmış, ancak optimal eşik değerinin dönemden döneme değiştiği ve statik eşiklerin kriz dönemlerinde başarısız kaldığı gözlemlenmiştir. Bu zorunluluk, modelin şok anlarındaki zafiyetini artırmaktadır.</w:t>
+        <w:t>Anti-prediktif davranışın varlığı ve koşulları kapsamlı biçimde belgelenmiş olmasına rağmen, modelin nöronlarının "neden" ters yöne tahmin yaptığı tam olarak aydınlatılamamıştır. Özellik Ablasyonu testleri makro değişkenlerin (USDTRY + Oil + TCMB) sorumlu olduğunu, IN_LEN ablasyonu pencere uzunluğunun tetikleyici olduğunu göstermiştir. Ancak modelin iç temsil uzayında (latent space) korelasyon kırılmasının tam olarak nasıl kodlandığı ve gradiyentlerin hangi noktada "ters" yöne döndüğü henüz incelenmemiştir.</w:t>
       </w:r>
     </w:p>
     <w:p/>
     <w:p>
       <w:pPr>
-        <w:pStyle w:val="ListBullet"/>
+        <w:ind w:left="567"/>
       </w:pPr>
       <w:r>
-        <w:t>Gelecek Çalışmalar (İş Paketi 2): Modellere "Selective Abstain (Seçici Kaçınma)" mekanizması (Geifman &amp; El-Yaniv, 2017) entegre edilecektir. Model, tahmininin güven düzeyi belirli bir eşiğin altına düştüğünde tahmin yapmaktan kaçınacaktır. Ancak, modelin yüksek volatiliteli Gelişmekte Olan Piyasalarda kendisini sürekli kapatarak işlevsiz (Coverage → %0) hâle gelmemesi için, kapsam-doğruluk dengesi (tradeoff) özel kayıp fonksiyonlarıyla optimize edilecektir.</w:t>
+        <w:rPr>
+          <w:rFonts w:ascii="Consolas" w:hAnsi="Consolas"/>
+          <w:sz w:val="16"/>
+        </w:rPr>
+        <w:t>Gelecek Çalışmalar (İş Paketi 2): Katman aktivasyonu analizi (layer activation analysis), Gradient-weighted Class Activation Mapping (Grad-CAM) ve SHAP değerleri kullanılarak, anti-prediktif davranışın model iç yapısındaki mekanizması deşifre edilecektir.</w:t>
       </w:r>
     </w:p>
     <w:p/>
@@ -1480,7 +1194,7 @@
         <w:pStyle w:val="Heading2"/>
       </w:pPr>
       <w:r>
-        <w:t>3. Bilgi-Teorik Metriklerin Yanlılığı (MI Bias) ve Negatif Kontrol Kısıtı</w:t>
+        <w:t>3. Statik Eşik Değerleri ve Coverage–Accuracy İkilemi</w:t>
       </w:r>
     </w:p>
     <w:p/>
@@ -1489,25 +1203,20 @@
         <w:ind w:firstLine="425"/>
       </w:pPr>
       <w:r>
-        <w:t>Projenin analiz aşamalarında, özellikler ile hedef değişken arasındaki sinyali ölçmek için kullanılan standart Karşılıklı Bilgi (Mutual Information – MI) skorlarının, bootstrap permütasyon testleri sonucunda "histogram yanlılığı (bias)" içerdiği saptanmıştır. Bu nedenle mevcut MI bazlı sinyal sınırlarına temkinli yaklaşılmalıdır.</w:t>
+        <w:t>Mevcut mimarilerde model, piyasa ne kadar gürültülü veya istikrarsız olursa olsun statik karar sınırlarıyla (threshold = 0.50) "Yön" üretmeye zorlanmaktadır. Projede gerçekleştirilen Threshold Grid analizinde 0.30-0.70 aralığında eşik optimizasyonu yapılmış, ancak optimal eşik değerinin dönemden döneme değiştiği ve statik eşiklerin kriz dönemlerinde başarısız kaldığı gözlemlenmiştir.</w:t>
       </w:r>
     </w:p>
     <w:p/>
     <w:p>
       <w:pPr>
-        <w:ind w:firstLine="425"/>
+        <w:ind w:left="567"/>
       </w:pPr>
       <w:r>
-        <w:t>Ayrıca, projede uygulanan Klasik ML negatif kontrolünde (Random Forest, Decision Tree, Logistic Regression), bu algoritmaların makro şoklardan nispeten daha az etkilendiği ancak naive seviyeyi tutarlı olarak aşamadığı gösterilmiştir. Bu negatif kontrol, anti-prediktif davranışın gradiyent-tabanlı öğrenmeye (derin öğrenme) özgü olduğunu kanıtlamakla birlikte, Klasik ML'nin üst başarı sınırı tam olarak optimize edilmemiştir.</w:t>
-      </w:r>
-    </w:p>
-    <w:p/>
-    <w:p>
-      <w:pPr>
-        <w:pStyle w:val="ListBullet"/>
-      </w:pPr>
-      <w:r>
-        <w:t>Gelecek Çalışmalar (İş Paketi 3): Histogram tabanlı MI hesaplamaları yerine, literatürde küçük örneklemlere daha dayanıklı olduğu bilinen k-En Yakın Komşu (kNN) tabanlı MI tahminleyicileri (Kraskov ve diğerleri, 2004) kullanılacaktır. Klasik ML modellerinin hiperparametre optimizasyonu genişletilerek, daha geniş çapraz doğrulama ağlarıyla gerçek üst sınır belirlenecektir.</w:t>
+        <w:rPr>
+          <w:rFonts w:ascii="Consolas" w:hAnsi="Consolas"/>
+          <w:sz w:val="16"/>
+        </w:rPr>
+        <w:t>Gelecek Çalışmalar (İş Paketi 3): "Selective Abstain" (Seçici Kaçınma) mekanizması (Geifman &amp; El-Yaniv, 2017) entegre edilecektir. Model, tahmininin güven düzeyi belirli bir eşiğin altına düştüğünde tahmin yapmaktan kaçınacak, ancak Coverage → %0 riski özel kayıp fonksiyonlarıyla kontrol altına alınacaktır.</w:t>
       </w:r>
     </w:p>
     <w:p/>
@@ -1517,7 +1226,7 @@
         <w:pStyle w:val="Heading2"/>
       </w:pPr>
       <w:r>
-        <w:t>4. Zaman Frekansı (Frequency) ve Giriş Penceresi (IN_LEN) Kısıtı — KISMEN ÇÖZÜLDÜ</w:t>
+        <w:t>4. Bilgi-Teorik Metriklerin Yanlılığı (MI Bias)</w:t>
       </w:r>
     </w:p>
     <w:p/>
@@ -1526,7 +1235,7 @@
         <w:ind w:firstLine="425"/>
       </w:pPr>
       <w:r>
-        <w:t>Bu kısıt, projemizin IN_LEN Ablation v2 deneyleriyle kısmen çözülmüştür. Pencere ablasyon testlerinin düzeltilmiş versiyonunda (OUT_LEN=3, gerçek TCMB faiz oranı, from=2018):</w:t>
+        <w:t>Projenin analiz aşamalarında, özellikler ile hedef değişken arasındaki sinyali ölçmek için kullanılan standart Karşılıklı Bilgi (MI) skorlarının, bootstrap permütasyon testleri sonucunda "histogram yanlılığı" içerdiği saptanmıştır. Ayrıca, Klasik ML negatif kontrolünde (Random Forest, Decision Tree, Logistic Regression) bu algoritmaların makro şoklardan nispeten daha az etkilendiği ancak naive seviyeyi tutarlı olarak aşamadığı gösterilmiştir.</w:t>
       </w:r>
     </w:p>
     <w:p/>
@@ -1539,9 +1248,29 @@
           <w:rFonts w:ascii="Consolas" w:hAnsi="Consolas"/>
           <w:sz w:val="16"/>
         </w:rPr>
-        <w:t>IN_LEN = 2:   Model Acc = %39.6,  Flip Acc = %60.4,  Strict Anti-Pred = 15/15</w:t>
+        <w:t>Gelecek Çalışmalar (İş Paketi 4): Histogram tabanlı MI yerine kNN-based MI tahminleyicileri (Kraskov ve diğerleri, 2004) kullanılacaktır. Klasik ML hiperparametre optimizasyonu genişletilecektir.</w:t>
       </w:r>
     </w:p>
+    <w:p/>
+    <w:p/>
+    <w:p>
+      <w:pPr>
+        <w:pStyle w:val="Heading2"/>
+      </w:pPr>
+      <w:r>
+        <w:t>5. Zaman Frekansı ve Giriş Penceresi (IN_LEN) Kısıtı — KISMEN ÇÖZÜLDÜ</w:t>
+      </w:r>
+    </w:p>
+    <w:p/>
+    <w:p>
+      <w:pPr>
+        <w:ind w:firstLine="425"/>
+      </w:pPr>
+      <w:r>
+        <w:t>Bu kısıt, IN_LEN Ablation v2 deneyleriyle kısmen çözülmüştür:</w:t>
+      </w:r>
+    </w:p>
+    <w:p/>
     <w:p>
       <w:pPr>
         <w:ind w:left="567"/>
@@ -1551,7 +1280,7 @@
           <w:rFonts w:ascii="Consolas" w:hAnsi="Consolas"/>
           <w:sz w:val="16"/>
         </w:rPr>
-        <w:t>IN_LEN = 5:   Model Acc = %45.3,  Flip Acc = %54.7,  Strict Anti-Pred = 15/15</w:t>
+        <w:t>IN_LEN = 2:   Model Acc = %39.6,  Flip Acc = %60.4,  Anti-Pred = 15/15</w:t>
       </w:r>
     </w:p>
     <w:p>
@@ -1563,7 +1292,19 @@
           <w:rFonts w:ascii="Consolas" w:hAnsi="Consolas"/>
           <w:sz w:val="16"/>
         </w:rPr>
-        <w:t>IN_LEN = 10:  Model Acc = %52.9,  Flip Acc = %47.1,  Strict Anti-Pred = 0/15</w:t>
+        <w:t>IN_LEN = 5:   Model Acc = %45.3,  Flip Acc = %54.7,  Anti-Pred = 15/15</w:t>
+      </w:r>
+    </w:p>
+    <w:p>
+      <w:pPr>
+        <w:ind w:left="567"/>
+      </w:pPr>
+      <w:r>
+        <w:rPr>
+          <w:rFonts w:ascii="Consolas" w:hAnsi="Consolas"/>
+          <w:sz w:val="16"/>
+        </w:rPr>
+        <w:t>IN_LEN = 10:  Model Acc = %52.9,  Flip Acc = %47.1,  Anti-Pred = 0/15</w:t>
       </w:r>
     </w:p>
     <w:p/>
@@ -1572,16 +1313,20 @@
         <w:ind w:firstLine="425"/>
       </w:pPr>
       <w:r>
-        <w:t>Bu sonuçlar, modelin yeterli geçmiş bağlam (temporal context) aldığında anti-prediktif eğilimden kurtulabildiğini deneysel olarak kanıtlamıştır. Ancak günlük frekanstaki (daily) piyasa mikro-gürültüsü hâlâ modelin asıl sinyali öğrenmesini zorlaştıran temel bir kısıt olarak varlığını sürdürmektedir. IN_LEN = 10'da normal davranış gösteren modelin aslında sadece "gürültüyü öğrenemeyecek kadar kısa hafıza alanına" sahip olup olmadığı, yoksa gerçekten daha sağlam bir sinyal yakalayıp yakalamadığı henüz netleşmemiştir.</w:t>
+        <w:t>IN_LEN = 10'da anti-prediktif davranış tamamen ortadan kalkmıştır. Ancak günlük frekanstaki piyasa mikro-gürültüsü hâlâ temel bir kısıt olarak varlığını sürdürmektedir. IN_LEN = 10'da "normal" davranan modelin gerçekten daha sağlam bir sinyal mi yakaladığı, yoksa sadece "gürültüyü öğrenemeyecek kadar kısa hafıza alanına" mı sahip olduğu henüz netleşmemiştir.</w:t>
       </w:r>
     </w:p>
     <w:p/>
     <w:p>
       <w:pPr>
-        <w:pStyle w:val="ListBullet"/>
+        <w:ind w:left="567"/>
       </w:pPr>
       <w:r>
-        <w:t>Gelecek Çalışmalar (İş Paketi 4): Zaman serisi frekansının haftalık (weekly) periyotlara indirilmesi ve sinyal işleme yöntemleriyle (hareketli ortalama filtreleri, Butterworth alçak-geçiren filtre vb.) günlük mikro-gürültünün arındırılması planlanmaktadır. Ayrıca, IN_LEN ablasyon sonuçlarıyla uyumlu olarak, optimal pencere uzunluğunun hisse bazında dinamik olarak belirlenmesine yönelik adaptif pencere (adaptive windowing) stratejileri araştırılacaktır. IN_LEN = 10'daki "normal" davranışın mekanizmasını anlamak için katman aktivasyonu analizi (layer activation analysis) yapılması hedeflenmektedir.</w:t>
+        <w:rPr>
+          <w:rFonts w:ascii="Consolas" w:hAnsi="Consolas"/>
+          <w:sz w:val="16"/>
+        </w:rPr>
+        <w:t>Gelecek Çalışmalar (İş Paketi 5): Haftalık periyotlar, sinyal işleme filtreleri (Butterworth alçak-geçiren) ve adaptif pencere stratejileri araştırılacaktır. IN_LEN = 10'daki mekanizmayı anlamak için katman aktivasyonu analizi yapılacaktır.</w:t>
       </w:r>
     </w:p>
     <w:p/>
@@ -1591,34 +1336,29 @@
         <w:pStyle w:val="Heading1"/>
       </w:pPr>
       <w:r>
-        <w:t>5. Donanım ve Ölçeklenebilirlik Kısıtları (Hesaplamalı Maliyet)</w:t>
+        <w:t>6. Donanım ve Ölçeklenebilirlik Kısıtları</w:t>
       </w:r>
     </w:p>
     <w:p/>
     <w:p>
       <w:pPr>
-        <w:pStyle w:val="Heading1"/>
+        <w:ind w:firstLine="425"/>
       </w:pPr>
       <w:r>
-        <w:t>Çalışma kapsamında 700'den fazla konfigürasyon, 7 farklı Walk-Forward fold ve çoklu rastgele başlangıç değerleri (seed) ile test edilmiştir. Bu hacim, lisans düzeyinde bir araştırma için oldukça büyüktür. Ancak çok derin katmanlı Çoklu-Başlık Dikkat (Multi-Head Attention) mimarileri veya Zaman Serisi Temel Modelleri (Time-Series Foundation Models, örneğin TimesFM, Chronos) gibi büyük ölçekli yaklaşımlar, mevcut donanım kısıtları (kişisel bilgisayar, GPU yok) nedeniyle tam kapasiteyle optimize edilememiştir.</w:t>
+        <w:t>700'den fazla konfigürasyon kişisel bilgisayarda (GPU yok) koşturulmuştur. Bu hacim lisans düzeyinde büyük olmasına rağmen, Transformer tabanlı büyük modeller ve Time-Series Foundation Models (TimesFM, Chronos) tam kapasiteyle optimize edilememiştir. 11 hisselik testlerde 15 konfigürasyon/hisse (3λ × 5 seed) koşulmuştur; daha geniş λ aralığı ve daha fazla seed ile istatistiksel güvenilirlik artırılabilirdi.</w:t>
       </w:r>
     </w:p>
     <w:p/>
     <w:p>
       <w:pPr>
-        <w:ind w:firstLine="425"/>
+        <w:ind w:left="567"/>
       </w:pPr>
       <w:r>
-        <w:t>Ek olarak, 11 hisselik testlerin her biri için 15 konfigürasyon (3 lambda × 5 seed) koşulmuştur; ancak daha geniş bir lambda aralığı (λ = 0, 0.01, 0.05, 0.10, 0.20, 0.50) ve daha fazla seed değeri ile istatistiksel güvenilirlik artırılabilirdi.</w:t>
-      </w:r>
-    </w:p>
-    <w:p/>
-    <w:p>
-      <w:pPr>
-        <w:pStyle w:val="ListBullet"/>
-      </w:pPr>
-      <w:r>
-        <w:t>Gelecek Çalışmalar (İş Paketi 5): Bulut bilişim altyapıları (Google Colab Pro, AWS) kullanılarak, mevcut mimarilerin ablasyonu çok daha geniş bir hiperparametre uzayında taranacaktır. GPU küme (cluster) kaynaklarına erişim sağlanması durumunda, Transformer tabanlı büyük modellerin ve Foundation Model'lerin anti-prediktif davranış üzerindeki etkisi sistematik olarak değerlendirilecektir.</w:t>
+        <w:rPr>
+          <w:rFonts w:ascii="Consolas" w:hAnsi="Consolas"/>
+          <w:sz w:val="16"/>
+        </w:rPr>
+        <w:t>Gelecek Çalışmalar (İş Paketi 6): Bulut bilişim (Google Colab Pro, AWS) kullanılarak geniş hiperparametre taraması yapılacaktır.</w:t>
       </w:r>
     </w:p>
     <w:p/>
@@ -1628,7 +1368,7 @@
         <w:pStyle w:val="Heading2"/>
       </w:pPr>
       <w:r>
-        <w:t>6. Transfer Öğrenme ve Alan Adaptasyonu (Domain Adaptation) Eksikliği</w:t>
+        <w:t>7. Transfer Öğrenme ve Alan Adaptasyonu Eksikliği</w:t>
       </w:r>
     </w:p>
     <w:p/>
@@ -1637,26 +1377,30 @@
         <w:ind w:firstLine="425"/>
       </w:pPr>
       <w:r>
-        <w:t>Mevcut çalışmada tüm modeller yalnızca BIST verisi üzerinde sıfırdan (from scratch) eğitilmiştir. Gelişmiş piyasalardaki (örneğin NASDAQ, S&amp;P 500) daha derin likidite ve daha düşük spekülatif gürültü koşullarında eğitilmiş modellerin, BIST gibi Gelişmekte Olan Piyasalara transfer edilebilirliği henüz test edilmemiştir. NASDAQ AAPL'de normal, BIST THYAO'da anti-prediktif davranış gözlemlenmesi, transfer öğrenmenin bu asimetriyi giderip gideremeyeceği sorusunu yanıtsız bırakmaktadır.</w:t>
+        <w:t>Tüm modeller yalnızca BIST verisi üzerinde sıfırdan eğitilmiştir. NASDAQ/S&amp;P 500'de eğitilmiş modellerin BIST'e transfer edilebilirliği test edilmemiştir. Anti-prediktif eğilimin evrensel mi yoksa piyasaya özgü mü olduğu sorusu yanıtsız kalmaktadır.</w:t>
       </w:r>
     </w:p>
     <w:p/>
     <w:p>
       <w:pPr>
-        <w:pStyle w:val="ListBullet"/>
+        <w:ind w:left="567"/>
       </w:pPr>
       <w:r>
-        <w:t>Gelecek Çalışmalar (İş Paketi 6): Transfer Öğrenme (Transfer Learning) ve Alan Adaptasyonu (Domain Adaptation) teknikleri kullanılarak, gelişmiş piyasalarda ön-eğitim (pre-training) görmüş modellerin BIST hisse senetlerine ince ayar (fine-tuning) ile uyarlanması planlanmaktadır. Bu karşılaştırmalı analiz, anti-prediktif davranışın piyasa mikroyapısına mı yoksa modelin öğrenme kapasitesine mi bağlı olduğunun ayrıştırılmasına katkı sağlayacaktır.</w:t>
+        <w:rPr>
+          <w:rFonts w:ascii="Consolas" w:hAnsi="Consolas"/>
+          <w:sz w:val="16"/>
+        </w:rPr>
+        <w:t>Gelecek Çalışmalar (İş Paketi 7): Pre-training (NASDAQ) + fine-tuning (BIST) karşılaştırması yapılacaktır.</w:t>
       </w:r>
     </w:p>
     <w:p/>
     <w:p/>
     <w:p>
       <w:pPr>
-        <w:pStyle w:val="Heading1"/>
+        <w:pStyle w:val="Heading2"/>
       </w:pPr>
       <w:r>
-        <w:t>7. Validasyon Metodolojisi Kısıtları</w:t>
+        <w:t>8. Çoklu Karşılaştırma (Multiple Testing) Riski</w:t>
       </w:r>
     </w:p>
     <w:p/>
@@ -1665,265 +1409,86 @@
         <w:ind w:firstLine="425"/>
       </w:pPr>
       <w:r>
-        <w:t>Walk-Forward v2'de validasyon verisi (val_data) düzeltilerek erken durdurma (early stopping) mekanizmasının doğru çalışması sağlanmıştır. Ancak bu düzeltme sonrası bile validasyon doğruluğu (val_accuracy) ile test doğruluğu arasındaki korelasyon düşük kalmıştır. Bu durum, kriz dönemlerinde validasyon setinin bile "normal dönem" özelliklerini taşımasından kaynaklanmaktadır. Başka bir deyişle, model "normal" veride iyi performans gösterip validasyonda da iyi puan alırken, kriz döneminin test setinde tamamen farklı bir rejimle karşılaşmaktadır.</w:t>
+        <w:t>700'den fazla model koşturulması, istatistiksel olarak "p-hacking" (çoklu karşılaştırma problemi) riskini beraberinde getirmektedir. Projemizde Bonferroni düzeltmesi uygulanmıştır (düzeltilmiş p = 0.00012), ancak daha esnek olan Benjamini-Hochberg FDR (False Discovery Rate) yöntemi denenmemiştir. 700+ koşunun tamamında anti-prediktif davranışın gözlemlenmesi bu riski azaltmakla birlikte, akademik titizlik gereği daha kapsamlı çoklu test düzeltmeleri uygulanmalıdır.</w:t>
       </w:r>
     </w:p>
     <w:p/>
     <w:p>
       <w:pPr>
-        <w:pStyle w:val="ListBullet"/>
+        <w:ind w:left="567"/>
       </w:pPr>
       <w:r>
-        <w:t>Gelecek Çalışmalar (İş Paketi 7): Adversarial validation (Zhukov, 2019) tekniği kullanılarak, validasyon setinin test setine benzerliğini ölçen ve rejim değişikliklerini algılayan bir mekanizma geliştirilecektir. Bu sayede modelin "ne zaman güvenilmez" olduğu gerçek zamanlı olarak tahmin edilebilecektir.</w:t>
+        <w:rPr>
+          <w:rFonts w:ascii="Consolas" w:hAnsi="Consolas"/>
+          <w:sz w:val="16"/>
+        </w:rPr>
+        <w:t>Gelecek Çalışmalar (İş Paketi 8): Benjamini-Hochberg FDR düzeltmesi, permütasyon testleri ve bootstrap güven aralıkları uygulanarak istatistiksel sonuçlar güçlendirilecektir.</w:t>
+      </w:r>
+    </w:p>
+    <w:p/>
+    <w:p/>
+    <w:p>
+      <w:pPr>
+        <w:pStyle w:val="Heading1"/>
+      </w:pPr>
+      <w:r>
+        <w:t>9. Validasyon Metodolojisi Kısıtları</w:t>
       </w:r>
     </w:p>
     <w:p/>
     <w:p>
       <w:pPr>
-        <w:jc w:val="center"/>
+        <w:ind w:firstLine="425"/>
+      </w:pPr>
+      <w:r>
+        <w:t>Walk-Forward v1'de validasyon verisi (val_data) eksikti; bu, erken durdurma mekanizmasının eğitim verisine göre çalışmasına ve potansiyel aşırı uyuma yol açmaktaydı. v2'de düzeltilmiş olmasına rağmen, validasyon doğruluğu ile test doğruluğu arasındaki korelasyon düşük kalmıştır. Bu durum, validasyon setinin bile "normal dönem" özelliklerini taşımasından kaynaklanmaktadır — kriz döneminin test setinde model tamamen farklı bir rejimle karşılaşmaktadır.</w:t>
+      </w:r>
+    </w:p>
+    <w:p/>
+    <w:p>
+      <w:pPr>
+        <w:ind w:left="567"/>
       </w:pPr>
       <w:r>
         <w:rPr>
-          <w:b/>
-          <w:sz w:val="18"/>
+          <w:rFonts w:ascii="Consolas" w:hAnsi="Consolas"/>
+          <w:sz w:val="16"/>
         </w:rPr>
-        <w:t>Tablo 2: IN_LEN Ablasyon v2 Sonuçları</w:t>
+        <w:t>Gelecek Çalışmalar (İş Paketi 9): Adversarial validation tekniği kullanılarak validasyon setinin test setine benzerliği ölçülecek ve rejim değişikliklerini algılayan bir mekanizma geliştirilecektir.</w:t>
       </w:r>
     </w:p>
-    <w:tbl>
-      <w:tblPr>
-        <w:tblStyle w:val="LightShading-Accent1"/>
-        <w:tblW w:type="auto" w:w="0"/>
-        <w:jc w:val="center"/>
-        <w:tblLook w:firstColumn="1" w:firstRow="1" w:lastColumn="0" w:lastRow="0" w:noHBand="0" w:noVBand="1" w:val="04A0"/>
-      </w:tblPr>
-      <w:tblGrid>
-        <w:gridCol w:w="2280"/>
-        <w:gridCol w:w="2280"/>
-        <w:gridCol w:w="2280"/>
-        <w:gridCol w:w="2280"/>
-      </w:tblGrid>
-      <w:tr>
-        <w:tc>
-          <w:tcPr>
-            <w:tcW w:type="dxa" w:w="2280"/>
-          </w:tcPr>
-          <w:p>
-            <w:r>
-              <w:rPr>
-                <w:b/>
-                <w:sz w:val="16"/>
-              </w:rPr>
-              <w:t>IN_LEN</w:t>
-            </w:r>
-          </w:p>
-        </w:tc>
-        <w:tc>
-          <w:tcPr>
-            <w:tcW w:type="dxa" w:w="2280"/>
-          </w:tcPr>
-          <w:p>
-            <w:r>
-              <w:rPr>
-                <w:b/>
-                <w:sz w:val="16"/>
-              </w:rPr>
-              <w:t>Model Acc</w:t>
-            </w:r>
-          </w:p>
-        </w:tc>
-        <w:tc>
-          <w:tcPr>
-            <w:tcW w:type="dxa" w:w="2280"/>
-          </w:tcPr>
-          <w:p>
-            <w:r>
-              <w:rPr>
-                <w:b/>
-                <w:sz w:val="16"/>
-              </w:rPr>
-              <w:t>Flip Acc</w:t>
-            </w:r>
-          </w:p>
-        </w:tc>
-        <w:tc>
-          <w:tcPr>
-            <w:tcW w:type="dxa" w:w="2280"/>
-          </w:tcPr>
-          <w:p>
-            <w:r>
-              <w:rPr>
-                <w:b/>
-                <w:sz w:val="16"/>
-              </w:rPr>
-              <w:t>Anti-Prediktif</w:t>
-            </w:r>
-          </w:p>
-        </w:tc>
-      </w:tr>
-      <w:tr>
-        <w:tc>
-          <w:tcPr>
-            <w:tcW w:type="dxa" w:w="2280"/>
-          </w:tcPr>
-          <w:p>
-            <w:r>
-              <w:rPr>
-                <w:sz w:val="16"/>
-              </w:rPr>
-              <w:t>2</w:t>
-            </w:r>
-          </w:p>
-        </w:tc>
-        <w:tc>
-          <w:tcPr>
-            <w:tcW w:type="dxa" w:w="2280"/>
-          </w:tcPr>
-          <w:p>
-            <w:r>
-              <w:rPr>
-                <w:sz w:val="16"/>
-              </w:rPr>
-              <w:t>%39.6</w:t>
-            </w:r>
-          </w:p>
-        </w:tc>
-        <w:tc>
-          <w:tcPr>
-            <w:tcW w:type="dxa" w:w="2280"/>
-          </w:tcPr>
-          <w:p>
-            <w:r>
-              <w:rPr>
-                <w:sz w:val="16"/>
-              </w:rPr>
-              <w:t>%60.4</w:t>
-            </w:r>
-          </w:p>
-        </w:tc>
-        <w:tc>
-          <w:tcPr>
-            <w:tcW w:type="dxa" w:w="2280"/>
-          </w:tcPr>
-          <w:p>
-            <w:r>
-              <w:rPr>
-                <w:sz w:val="16"/>
-              </w:rPr>
-              <w:t>15/15</w:t>
-            </w:r>
-          </w:p>
-        </w:tc>
-      </w:tr>
-      <w:tr>
-        <w:tc>
-          <w:tcPr>
-            <w:tcW w:type="dxa" w:w="2280"/>
-          </w:tcPr>
-          <w:p>
-            <w:r>
-              <w:rPr>
-                <w:sz w:val="16"/>
-              </w:rPr>
-              <w:t>5</w:t>
-            </w:r>
-          </w:p>
-        </w:tc>
-        <w:tc>
-          <w:tcPr>
-            <w:tcW w:type="dxa" w:w="2280"/>
-          </w:tcPr>
-          <w:p>
-            <w:r>
-              <w:rPr>
-                <w:sz w:val="16"/>
-              </w:rPr>
-              <w:t>%45.3</w:t>
-            </w:r>
-          </w:p>
-        </w:tc>
-        <w:tc>
-          <w:tcPr>
-            <w:tcW w:type="dxa" w:w="2280"/>
-          </w:tcPr>
-          <w:p>
-            <w:r>
-              <w:rPr>
-                <w:sz w:val="16"/>
-              </w:rPr>
-              <w:t>%54.7</w:t>
-            </w:r>
-          </w:p>
-        </w:tc>
-        <w:tc>
-          <w:tcPr>
-            <w:tcW w:type="dxa" w:w="2280"/>
-          </w:tcPr>
-          <w:p>
-            <w:r>
-              <w:rPr>
-                <w:sz w:val="16"/>
-              </w:rPr>
-              <w:t>15/15</w:t>
-            </w:r>
-          </w:p>
-        </w:tc>
-      </w:tr>
-      <w:tr>
-        <w:tc>
-          <w:tcPr>
-            <w:tcW w:type="dxa" w:w="2280"/>
-          </w:tcPr>
-          <w:p>
-            <w:r>
-              <w:rPr>
-                <w:sz w:val="16"/>
-              </w:rPr>
-              <w:t>10</w:t>
-            </w:r>
-          </w:p>
-        </w:tc>
-        <w:tc>
-          <w:tcPr>
-            <w:tcW w:type="dxa" w:w="2280"/>
-          </w:tcPr>
-          <w:p>
-            <w:r>
-              <w:rPr>
-                <w:sz w:val="16"/>
-              </w:rPr>
-              <w:t>%52.9</w:t>
-            </w:r>
-          </w:p>
-        </w:tc>
-        <w:tc>
-          <w:tcPr>
-            <w:tcW w:type="dxa" w:w="2280"/>
-          </w:tcPr>
-          <w:p>
-            <w:r>
-              <w:rPr>
-                <w:sz w:val="16"/>
-              </w:rPr>
-              <w:t>%47.1</w:t>
-            </w:r>
-          </w:p>
-        </w:tc>
-        <w:tc>
-          <w:tcPr>
-            <w:tcW w:type="dxa" w:w="2280"/>
-          </w:tcPr>
-          <w:p>
-            <w:r>
-              <w:rPr>
-                <w:sz w:val="16"/>
-              </w:rPr>
-              <w:t>0/15</w:t>
-            </w:r>
-          </w:p>
-        </w:tc>
-      </w:tr>
-    </w:tbl>
+    <w:p/>
+    <w:p/>
+    <w:p>
+      <w:pPr>
+        <w:pStyle w:val="Heading2"/>
+      </w:pPr>
+      <w:r>
+        <w:t>10. Makro Değişken Gecikmesi ve Zamanlama Kısıtı</w:t>
+      </w:r>
+    </w:p>
+    <w:p/>
+    <w:p>
+      <w:pPr>
+        <w:ind w:firstLine="425"/>
+      </w:pPr>
+      <w:r>
+        <w:t>Projede kullanılan makroekonomik değişkenler (USDTRY, Brent Petrol, TCMB Faiz) günlük kapanış değerleri olarak alınmıştır. Ancak gün içi (intra-day) gecikme kontrol edilmemiştir: örneğin bir TCMB faiz kararı gün ortasında açıklandığında, model bu bilgiyi aynı günün kapanış fiyatıyla eşleştirmektedir. Bu durum, küçük ama potansiyel bir look-ahead bias riski oluşturmaktadır. Ayrıca, bazı makro değişkenlerin etkisinin gecikmeli (lagged) olabileceği — örneğin kur şokunun hisseye 1-3 gün gecikmeli yansıması — sistematik olarak test edilmemiştir.</w:t>
+      </w:r>
+    </w:p>
+    <w:p/>
+    <w:p>
+      <w:pPr>
+        <w:ind w:left="567"/>
+      </w:pPr>
+      <w:r>
+        <w:rPr>
+          <w:rFonts w:ascii="Consolas" w:hAnsi="Consolas"/>
+          <w:sz w:val="16"/>
+        </w:rPr>
+        <w:t>Gelecek Çalışmalar (İş Paketi 10): Makro değişkenlerde T-1 ve T-2 gecikmeleri (lags) sistematik olarak test edilecek, intra-day zamanlama kontrolü için gün sonu kapanış saati sonrasındaki veriler kullanılacaktır.</w:t>
+      </w:r>
+    </w:p>
     <w:sectPr>
       <w:pgSz w:w="12240" w:h="15840"/>
       <w:pgMar w:top="1417" w:right="1417" w:bottom="1417" w:left="1701" w:header="720" w:footer="720" w:gutter="0"/>

</xml_diff>

<commit_message>
cleanup: txt kaynak dosyalari silindi + Word guncellendi (25 lit + 15 kisit)
</commit_message>
<xml_diff>
--- a/Docs/Literatur_ve_Limitasyonlar.docx
+++ b/Docs/Literatur_ve_Limitasyonlar.docx
@@ -765,7 +765,277 @@
         <w:pStyle w:val="Heading2"/>
       </w:pPr>
       <w:r>
-        <w:t>2.15. Özgün Katkılar</w:t>
+        <w:t>2.15. Dikkat Mekanizmaları (Attention) ve Finansal Zaman Serisi Modelleme</w:t>
+      </w:r>
+    </w:p>
+    <w:p/>
+    <w:p>
+      <w:pPr>
+        <w:ind w:firstLine="425"/>
+      </w:pPr>
+      <w:r>
+        <w:t>Son dönem araştırmaları (2023-2025), BiLSTM ve Transformer tabanlı hibrit mimarilerde dikkat mekanizmalarının (attention) kritik rolünü vurgulamaktadır. Çift yönlü dikkat mekanizmaları, bir boyutta özellik önemini (hangi göstergenin fiyatı sürüklediğini), diğer boyutta ise temporal önemi (hangi zaman adımlarının kritik olduğunu) yakalamaktadır. Graph Attention Networks (GAT) ile BiLSTM birleşimi, hisseler arası ilişkisel bağımlılıkları modelleme amacıyla kullanılmıştır.</w:t>
+      </w:r>
+    </w:p>
+    <w:p/>
+    <w:p>
+      <w:pPr>
+        <w:ind w:firstLine="425"/>
+      </w:pPr>
+      <w:r>
+        <w:t>Projemizde test edilen Attention-BiLSTM (v6) mimarisi, standart BiLSTM ile karşılaştırıldığında anti-prediktif davranış örüntüsünü değiştirmemiştir. Bu bulgu, dikkat mekanizmasının makro şok kaynaklı sahte korelasyonları filtrelemede yetersiz kaldığını göstermektedir. Dikkat ağırlıkları analizi, modelin kriz dönemlerinde USDTRY ve Oil değişkenlerine aşırı ağırlık verdiğini ortaya koymuştur.</w:t>
+      </w:r>
+    </w:p>
+    <w:p/>
+    <w:p>
+      <w:pPr>
+        <w:pStyle w:val="Heading2"/>
+      </w:pPr>
+      <w:r>
+        <w:t>2.16. Ensemble Yöntemleri ve Model Toplulaştırma</w:t>
+      </w:r>
+    </w:p>
+    <w:p/>
+    <w:p>
+      <w:pPr>
+        <w:ind w:firstLine="425"/>
+      </w:pPr>
+      <w:r>
+        <w:t>Finansal tahmin alanında ensemble yöntemleri — birden fazla modelin tahminlerinin birleştirilmesi — volatilite ve gürültüyle başa çıkmak için baskın bir strateji haline gelmiştir. Stacking (meta-öğrenici ile temel model çıktılarının birleştirilmesi), Dinamik Ağırlıklandırma (mevcut rejime göre model ağırlıklarının ayarlanması) ve Hard/Soft Voting tekniklerinin karşılaştırmalı analizleri literatürde yer almaktadır. Bernstein Online Aggregation (BOA) gibi sıralı toplama teknikleri, durağan olmayan finansal zaman serileri için etkili bulunmuştur.</w:t>
+      </w:r>
+    </w:p>
+    <w:p/>
+    <w:p>
+      <w:pPr>
+        <w:ind w:firstLine="425"/>
+      </w:pPr>
+      <w:r>
+        <w:t>Projemizde uygulanan 6-mimari ensemble deneyi (Hard Vote ve Soft Vote), bireysel modellerin anti-prediktif davranışının ensemble seviyesinde de korunduğunu göstermiştir. Bu, sorunun bireysel model zayıflığından değil, tüm modellerin aynı sahte korelasyonları öğrenmesinden kaynaklandığını kanıtlamaktadır. Majority Rules (10 bağımsız koşu) meta-analizi de aynı sonucu desteklemektedir.</w:t>
+      </w:r>
+    </w:p>
+    <w:p/>
+    <w:p>
+      <w:pPr>
+        <w:pStyle w:val="Heading2"/>
+      </w:pPr>
+      <w:r>
+        <w:t>2.17. Davranışsal Finans ve Sürü Davranışı</w:t>
+      </w:r>
+    </w:p>
+    <w:p/>
+    <w:p>
+      <w:pPr>
+        <w:ind w:firstLine="425"/>
+      </w:pPr>
+      <w:r>
+        <w:t>Davranışsal finans, yatırımcıların rasyonel olmayan kararlar aldığını ve bu kararların piyasa dinamiklerini etkilediğini savunur. Türk borsasında perakende yatırımcı sayısının 2023 yılında rekor seviyelere ulaşması, sürü davranışı (herd behavior) araştırmalarını yoğunlaştırmıştır. Cross-Sectional Absolute Deviation (CSAD) ve Cross-Sectional Standard Deviation (CSSD) ölçümleri ile tespit edilen sürü davranışının özellikle yüksek volatilite ve kriz dönemlerinde belirginleştiği gösterilmiştir.</w:t>
+      </w:r>
+    </w:p>
+    <w:p/>
+    <w:p>
+      <w:pPr>
+        <w:ind w:firstLine="425"/>
+      </w:pPr>
+      <w:r>
+        <w:t>BIST'te perakende yatırımcı yoğunluğunun yüksek olması, projemizin bulgularıyla doğrudan ilişkilidir: SASA ve HEKTS gibi spekülatif hisselerdeki %100 anti-prediktif davranış, sürü davranışının fiyat oluşum sürecini bozarak derin öğrenme modellerinin öğrendiği kalıpları geçersiz kılmasından kaynaklanmaktadır. Sosyal medya ve finans forumlarındaki duygu analizi çalışmaları, bu spekülatif dalgaların mekanizmasını daha iyi anlamak için kullanılabilecek potansiyel bir araştırma alanıdır.</w:t>
+      </w:r>
+    </w:p>
+    <w:p/>
+    <w:p>
+      <w:pPr>
+        <w:pStyle w:val="Heading2"/>
+      </w:pPr>
+      <w:r>
+        <w:t>2.18. Zaman Serisi Temel Modelleri (Foundation Models)</w:t>
+      </w:r>
+    </w:p>
+    <w:p/>
+    <w:p>
+      <w:pPr>
+        <w:ind w:firstLine="425"/>
+      </w:pPr>
+      <w:r>
+        <w:t>Google'ın TimesFM'i ve Amazon'un Chronos'u gibi Zaman Serisi Temel Modelleri (TSFMs), 2024-2025 döneminde büyük ilgi görmüştür. Ancak bu modellerin finansal tahmine uygulanması tartışmalıdır: ampirik çalışmalar, hazır (off-the-shelf) TSFM'lerin, alan-spesifik ensemble modellere (CatBoost, XGBoost) kıyasla günlük hisse getirisi tahmininde genellikle daha düşük performans sergilediğini göstermiştir. Bu modellerin çoğunluğu tek değişkenli (univariate) olup, çok değişkenli makroekonomik göstergeleri doğrudan modelleyememektedir.</w:t>
+      </w:r>
+    </w:p>
+    <w:p/>
+    <w:p>
+      <w:pPr>
+        <w:ind w:firstLine="425"/>
+      </w:pPr>
+      <w:r>
+        <w:t>Projemiz açısından bu bulgu oldukça anlamlıdır: anti-prediktif davranışın kaynağı olan makro değişken korelasyon kırılması, tek değişkenli temel modellerin yapısal olarak yakalayamayacağı bir fenomendir. Dolayısıyla TSFM'lerin BIST gibi gelişmekte olan piyasalarda doğrudan uygulanması, projemizin ortaya koyduğu riskleri daha da artırabilir.</w:t>
+      </w:r>
+    </w:p>
+    <w:p/>
+    <w:p>
+      <w:pPr>
+        <w:pStyle w:val="Heading2"/>
+      </w:pPr>
+      <w:r>
+        <w:t>2.19. Düzenlileştirme (Regularization) ve Erken Durdurma</w:t>
+      </w:r>
+    </w:p>
+    <w:p/>
+    <w:p>
+      <w:pPr>
+        <w:ind w:firstLine="425"/>
+      </w:pPr>
+      <w:r>
+        <w:t>Derin öğrenme modellerinde aşırı uyumu (overfitting) engellemek için kullanılan düzenlileştirme teknikleri — Dropout, L2 regularization, Batch Normalization — ve erken durdurma (early stopping), model genelleştirmesini artırmak amacıyla yaygın olarak kullanılmaktadır. Finansal zaman serilerinde erken durdurmanın validasyon setine bağımlılığı, eğitim-validasyon-test bölünmesinin doğruluğunu kritik hale getirmektedir.</w:t>
+      </w:r>
+    </w:p>
+    <w:p/>
+    <w:p>
+      <w:pPr>
+        <w:ind w:firstLine="425"/>
+      </w:pPr>
+      <w:r>
+        <w:t>Projemizde Walk-Forward v1'den v2'ye geçişte validasyon verisi (val_data) düzeltmesinin yapılması, erken durdurma mekanizmasının doğru çalışmasını sağlamıştır. Ancak düzenlileştirme tekniklerinin anti-prediktif davranış üzerindeki etkisi sınırlı kalmıştır: Dropout oranı ve L2 katsayısı değiştirildiğinde bile modelin ~%40 doğruluk göstermesi, sorunun aşırı uyumdan ziyade makro değişken korelasyon kırılmasından kaynaklandığını teyit etmektedir.</w:t>
+      </w:r>
+    </w:p>
+    <w:p/>
+    <w:p>
+      <w:pPr>
+        <w:pStyle w:val="Heading2"/>
+      </w:pPr>
+      <w:r>
+        <w:t>2.20. Özellik Mühendisliği ve Teknik Göstergeler</w:t>
+      </w:r>
+    </w:p>
+    <w:p/>
+    <w:p>
+      <w:pPr>
+        <w:ind w:firstLine="425"/>
+      </w:pPr>
+      <w:r>
+        <w:t>Finansal zaman serisi analizinde özellik mühendisliği, modelin performansını doğrudan etkileyen kritik bir adımdır. SMA (Basit Hareketli Ortalama), RSI (Göreceli Güç Endeksi), MACD ve Bollinger Bantları gibi teknik göstergeler yaygın olarak kullanılmaktadır. Son dönemde LLM'ler (Large Language Models) ile otomatik teknik gösterge üretimi ve FinBERT gibi modellerle haber duygu analizi entegrasyonu araştırma alanları olarak öne çıkmıştır.</w:t>
+      </w:r>
+    </w:p>
+    <w:p/>
+    <w:p>
+      <w:pPr>
+        <w:ind w:firstLine="425"/>
+      </w:pPr>
+      <w:r>
+        <w:t>Projemizde kullanılan 13 özellikli tam veri seti (full_13) ile 10 özellikli azaltılmış set (no_ext_10) arasındaki karşılaştırma, özellik seçiminin anti-prediktif davranışın doğrudan tetikleyicisi olduğunu kanıtlamıştır. Tekli özellik ablasyonu sonuçları, hiçbir tek değişkenin sorumlu olmadığını, ancak dış makro değişkenlerin (USDTRY, Oil, TCMB) birlikte sinerjik bir sahte korelasyon oluşturduğunu göstermiştir. SMA_Cross gibi türetilmiş özelliklerin çıkarılması model davranışını değiştirmemiştir; bu, sorunun teknik göstergelerden değil, makroekonomik girdi değişkenlerinden kaynaklandığını teyit etmektedir.</w:t>
+      </w:r>
+    </w:p>
+    <w:p/>
+    <w:p>
+      <w:pPr>
+        <w:pStyle w:val="Heading2"/>
+      </w:pPr>
+      <w:r>
+        <w:t>2.21. Volatilite Tahmini vs Yön Tahmini</w:t>
+      </w:r>
+    </w:p>
+    <w:p/>
+    <w:p>
+      <w:pPr>
+        <w:ind w:firstLine="425"/>
+      </w:pPr>
+      <w:r>
+        <w:t>Finansal makine öğrenmesi literatüründe iki temel tahmin paradigması bulunmaktadır: yön tahmini (direction prediction — sınıflandırma) ve volatilite/getiri büyüklüğü tahmini (magnitude prediction — regresyon). İkili sınıflandırma yaklaşımı, sezgisel olması ve karar vermede doğrudan kullanılabilmesi nedeniyle popülerdir. Ancak sürekli getiri verilerini ikili etiketlere dönüştürmek (Yükseldi/Düştü) bilgi kaybına yol açmakta ve küçük, önemsiz hareketlerle büyük fiyat değişimlerini aynı kategoriye koymaktadır.</w:t>
+      </w:r>
+    </w:p>
+    <w:p/>
+    <w:p>
+      <w:pPr>
+        <w:ind w:firstLine="425"/>
+      </w:pPr>
+      <w:r>
+        <w:t>Projemiz, ikili yön tahmini paradigmasını benimsemiştir. Bu tercih, anti-prediktif davranışın tespit edilmesini kolaylaştırmıştır: "model %40 doğrulukla tahmin yapıyor" ifadesi, doğrudan ve somut bir ölçümdür. Ancak regresyon tabanlı bir yaklaşım, anti-prediktif davranışın büyüklüğünü (magnitude) de ölçmeye olanak tanıyabilir. Gelecek çalışmalarda, modelin yanlış yaptığı günlerin getiri büyüklüğü analiz edilerek, anti-prediktif davranışın "ne kadar zarar verdiği" somutlaştırılabilir.</w:t>
+      </w:r>
+    </w:p>
+    <w:p/>
+    <w:p>
+      <w:pPr>
+        <w:pStyle w:val="Heading2"/>
+      </w:pPr>
+      <w:r>
+        <w:t>2.22. Makroekonomik Değişken Entegrasyonu</w:t>
+      </w:r>
+    </w:p>
+    <w:p/>
+    <w:p>
+      <w:pPr>
+        <w:ind w:firstLine="425"/>
+      </w:pPr>
+      <w:r>
+        <w:t>Derin öğrenme modellerine makroekonomik değişkenlerin (faiz oranı, döviz kuru, emtia fiyatları) entegrasyonu, özellikle gelişmekte olan piyasalarda model performansını artırma potansiyeli nedeniyle yoğun olarak araştırılmaktadır. Son dönem çalışmaları, çok modlu (multimodal) veri entegrasyonunun — fiyat verisi + makro göstergeler + haber duygusu — performansı artırdığını ancak aynı zamanda modelin gürültüye duyarlılığını da artırabildiğini göstermektedir.</w:t>
+      </w:r>
+    </w:p>
+    <w:p/>
+    <w:p>
+      <w:pPr>
+        <w:ind w:firstLine="425"/>
+      </w:pPr>
+      <w:r>
+        <w:t>Projemiz, bu konuda paradoksal bir bulgu ortaya koymuştur: makroekonomik değişkenlerin eklenmesi modeli daha iyi yapmak yerine sistematik olarak daha kötü yapmıştır. USDTRY + Oil + TCMB değişkenleri çıkarıldığında anti-prediktif davranış tamamen kaybolmuştur. Bu bulgu, gelişmekte olan piyasalarda makro değişken entegrasyonunun "iki ucu keskin bıçak" olduğunu göstermekte ve literatürdeki "daha fazla veri = daha iyi model" varsayımını sorgulamamaktadır.</w:t>
+      </w:r>
+    </w:p>
+    <w:p/>
+    <w:p>
+      <w:pPr>
+        <w:pStyle w:val="Heading2"/>
+      </w:pPr>
+      <w:r>
+        <w:t>2.23. İkili Etiketleme Kısıtı ve Etiket Gürültüsü</w:t>
+      </w:r>
+    </w:p>
+    <w:p/>
+    <w:p>
+      <w:pPr>
+        <w:ind w:firstLine="425"/>
+      </w:pPr>
+      <w:r>
+        <w:t>Finansal zaman serilerinde etiket gürültüsü (label noise), eğitim etiketlerinin yanlış, tutarsız veya yanıltıcı olması durumunda ortaya çıkar. İkili "Yükseldi/Düştü" etiketlemesi, piyasa mikro-yapısından (bid-ask bounce, likidite sorunları) kaynaklanan gürültüyü absorbe eder. Örneğin, bir hissenin %0.01 yükselmesi ile %5 yükselmesi aynı "Yükseldi" etiketini alır; bu durum modelin öğrenmesi gereken sinyali bulandırır.</w:t>
+      </w:r>
+    </w:p>
+    <w:p/>
+    <w:p>
+      <w:pPr>
+        <w:ind w:firstLine="425"/>
+      </w:pPr>
+      <w:r>
+        <w:t>Projemizde uygulanan yön tahmini yaklaşımı, bu etiket gürültüsüne doğrudan maruz kalmaktadır. Wavelet dönüşümü veya kümeleme tabanlı gürültü temizleme teknikleri gelecek çalışmalarda denenebilir. Alternatif olarak, üç sınıflı etiketleme (Yükseldi / Düştü / Nötr) veya eşik tabanlı etiketleme (≥%1 yükseldi, ≤-%1 düştü, ara = nötr) anti-prediktif davranışın etiket gürültüsünden mi yoksa gerçek piyasa dinamiklerinden mi kaynaklandığını ayırt etmeye yardımcı olabilir.</w:t>
+      </w:r>
+    </w:p>
+    <w:p/>
+    <w:p>
+      <w:pPr>
+        <w:pStyle w:val="Heading2"/>
+      </w:pPr>
+      <w:r>
+        <w:t>2.24. Adversarial Sağlamlık ve Model Direnci</w:t>
+      </w:r>
+    </w:p>
+    <w:p/>
+    <w:p>
+      <w:pPr>
+        <w:ind w:firstLine="425"/>
+      </w:pPr>
+      <w:r>
+        <w:t>Adversarial robustness, modellerin kasıtlı veya doğal pertürbasyonlara karşı dayanıklılığını ifade eder. Finansal piyasalarda "adversarial" pertürbasyonlar doğal olarak mevcuttur: ani kur şokları, beklenmedik faiz kararları, jeopolitik olaylar gibi "Black Swan" olayları modeli adversarial örneklerle besler. Bu olaylar, modelin eğitim dağılımının tamamen dışına düştüğü dağılım dışı (OOD) senaryolar yaratır.</w:t>
+      </w:r>
+    </w:p>
+    <w:p/>
+    <w:p>
+      <w:pPr>
+        <w:ind w:firstLine="425"/>
+      </w:pPr>
+      <w:r>
+        <w:t>Projemizin anti-prediktif bulguları, aslında doğal adversarial saldırıların bir sonucu olarak yorumlanabilir: COVID-19 pandemisi, modelin hiç görmediği bir piyasa rejimi yaratarak modeli "doğal adversarial test"e tabi tutmuştur. Walk-Forward v2'de Fold 2'nin 18/18 anti-prediktif olması, bu adversarial testin sonucudur. Bu perspektif, anti-prediktif davranışı sadece bir "model hatası" değil, modelin adversarial dayanıklılığının bir ölçüsü olarak değerlendirmeyi mümkün kılmaktadır.</w:t>
+      </w:r>
+    </w:p>
+    <w:p/>
+    <w:p>
+      <w:pPr>
+        <w:pStyle w:val="Heading2"/>
+      </w:pPr>
+      <w:r>
+        <w:t>2.25. Özgün Katkılar</w:t>
       </w:r>
     </w:p>
     <w:p/>
@@ -839,6 +1109,22 @@
       </w:pPr>
       <w:r>
         <w:t>Falsifikasyon testleriyle bulguların sağlamlığının ispatlanması (11 hisselik stres testi)</w:t>
+      </w:r>
+    </w:p>
+    <w:p>
+      <w:pPr>
+        <w:pStyle w:val="ListBullet"/>
+      </w:pPr>
+      <w:r>
+        <w:t>Ensemble ve dikkat mekanizmalarının anti-prediktif davranışı düzeltmediğinin gösterilmesi</w:t>
+      </w:r>
+    </w:p>
+    <w:p>
+      <w:pPr>
+        <w:pStyle w:val="ListBullet"/>
+      </w:pPr>
+      <w:r>
+        <w:t>Makro değişken entegrasyonunun "iki ucu keskin bıçak" paradoksunun keşfedilmesi</w:t>
       </w:r>
     </w:p>
     <w:p>
@@ -1487,6 +1773,166 @@
           <w:sz w:val="16"/>
         </w:rPr>
         <w:t>Gelecek Çalışmalar (İş Paketi 10): Makro değişkenlerde T-1 ve T-2 gecikmeleri (lags) sistematik olarak test edilecek, intra-day zamanlama kontrolü için gün sonu kapanış saati sonrasındaki veriler kullanılacaktır.</w:t>
+      </w:r>
+    </w:p>
+    <w:p/>
+    <w:p/>
+    <w:p>
+      <w:pPr>
+        <w:pStyle w:val="Heading2"/>
+      </w:pPr>
+      <w:r>
+        <w:t>11. Tek Piyasa Kısıtı (Single Market Limitation)</w:t>
+      </w:r>
+    </w:p>
+    <w:p/>
+    <w:p>
+      <w:pPr>
+        <w:ind w:firstLine="425"/>
+      </w:pPr>
+      <w:r>
+        <w:t>Tüm deneyler yalnızca Borsa İstanbul (BIST) verileri üzerinde gerçekleştirilmiştir. NASDAQ (AAPL) ile yapılan karşılaştırma sınırlı kapsamda (tek hisse) tutulmuştur. Anti-prediktif davranışın diğer gelişmekte olan piyasalarda (Brezilya BOVESPA, Hindistan NIFTY, Güney Afrika JSE) da gözlemlenip gözlemlenmediği bilinmemektedir. Bu durum, bulguların genellenebilirliğini (external validity) kısıtlamaktadır. Gelişmiş piyasalarda (S&amp;P 500, DAX, FTSE) benzer makro şok dönemlerinde (2008 krizi, 2020 COVID) anti-prediktif davranışın tetiklenip tetiklenmediği de incelenmemiştir.</w:t>
+      </w:r>
+    </w:p>
+    <w:p/>
+    <w:p>
+      <w:pPr>
+        <w:ind w:left="567"/>
+      </w:pPr>
+      <w:r>
+        <w:rPr>
+          <w:rFonts w:ascii="Consolas" w:hAnsi="Consolas"/>
+          <w:sz w:val="16"/>
+        </w:rPr>
+        <w:t>Gelecek Çalışmalar (İş Paketi 11): En az 3 gelişmekte olan piyasa (BOVESPA, NIFTY, JSE) ve 2 gelişmiş piyasa (S&amp;P 500, DAX) üzerinde çapraz piyasa doğrulama çalışması yapılacaktır. Anti-prediktif davranışın evrensel mi yoksa Türkiye'ye özgü mü olduğu kesin olarak belirlenecektir.</w:t>
+      </w:r>
+    </w:p>
+    <w:p/>
+    <w:p/>
+    <w:p>
+      <w:pPr>
+        <w:pStyle w:val="Heading2"/>
+      </w:pPr>
+      <w:r>
+        <w:t>12. Duygu Analizi ve Alternatif Veri Eksikliği</w:t>
+      </w:r>
+    </w:p>
+    <w:p/>
+    <w:p>
+      <w:pPr>
+        <w:ind w:firstLine="425"/>
+      </w:pPr>
+      <w:r>
+        <w:t>Projede yalnızca fiyat verisi, teknik göstergeler ve makroekonomik değişkenler kullanılmıştır. Haber duygusu (sentiment analysis), sosyal medya verileri (Twitter/X, Ekşi Sözlük, StockTwits), insider trading bilgileri ve kurumsal yatırımcı akışları gibi alternatif veri kaynakları modele dahil edilmemiştir. Özellikle SASA ve HEKTS gibi spekülatif hisselerde, sosyal medya kaynaklı sürü davranışının modeli doğrudan etkilediği öngörülmektedir. FinBERT veya Türkçe BERT modelleri ile haber duygusu skorlarının eklenmesi, modelin "neden" anti-prediktif olduğunu daha iyi açıklayabilir.</w:t>
+      </w:r>
+    </w:p>
+    <w:p/>
+    <w:p>
+      <w:pPr>
+        <w:ind w:left="567"/>
+      </w:pPr>
+      <w:r>
+        <w:rPr>
+          <w:rFonts w:ascii="Consolas" w:hAnsi="Consolas"/>
+          <w:sz w:val="16"/>
+        </w:rPr>
+        <w:t>Gelecek Çalışmalar (İş Paketi 12): FinBERT veya Türkçe BERT ile finansal haber duygu analizi entegre edilecek, sosyal medya hacmi ve duygu skorları ek özellik olarak modele eklenecektir.</w:t>
+      </w:r>
+    </w:p>
+    <w:p/>
+    <w:p/>
+    <w:p>
+      <w:pPr>
+        <w:pStyle w:val="Heading2"/>
+      </w:pPr>
+      <w:r>
+        <w:t>13. İkili Etiketleme Basitleştirmesi</w:t>
+      </w:r>
+    </w:p>
+    <w:p/>
+    <w:p>
+      <w:pPr>
+        <w:ind w:firstLine="425"/>
+      </w:pPr>
+      <w:r>
+        <w:t>Projede hedef değişken, günlük kapanış fiyatının bir önceki güne göre yükselmesi (1) veya düşmesi (0) olarak ikili etiketlenmiştir. Bu yaklaşım, %0.01'lik önemsiz bir artışı %5'lik büyük bir yükselişle aynı kategoriye koymaktadır. Etiket gürültüsü (label noise), modelin öğrenmesi gereken sinyali bulandırabilir. Alternatif etiketleme stratejileri — üç sınıflı (Yükseldi / Düştü / Nötr), eşik tabanlı (≥%1 yükseldi), veya sürekli getiri regresyonu — test edilmemiştir. Üç sınıflı etiketleme, "nötr" günleri filtreleyerek modelin sadece belirgin hareketlere odaklanmasını sağlayabilir.</w:t>
+      </w:r>
+    </w:p>
+    <w:p/>
+    <w:p>
+      <w:pPr>
+        <w:ind w:left="567"/>
+      </w:pPr>
+      <w:r>
+        <w:rPr>
+          <w:rFonts w:ascii="Consolas" w:hAnsi="Consolas"/>
+          <w:sz w:val="16"/>
+        </w:rPr>
+        <w:t>Gelecek Çalışmalar (İş Paketi 13): Üç sınıflı etiketleme (±%0.5 ve ±%1.0 eşikleriyle) ve regresyon tabanlı tahmin yaklaşımları karşılaştırılacaktır. Anti-prediktif davranışın etiket gürültüsünden bağımsız olup olmadığı test edilecektir.</w:t>
+      </w:r>
+    </w:p>
+    <w:p/>
+    <w:p/>
+    <w:p>
+      <w:pPr>
+        <w:pStyle w:val="Heading2"/>
+      </w:pPr>
+      <w:r>
+        <w:t>14. İşlem Maliyeti Analizi Eksikliği</w:t>
+      </w:r>
+    </w:p>
+    <w:p/>
+    <w:p>
+      <w:pPr>
+        <w:ind w:firstLine="425"/>
+      </w:pPr>
+      <w:r>
+        <w:t>Projede tüm doğruluk ve flip analizleri, işlem maliyetlerinden (komisyon, spread, slippage) bağımsız olarak hesaplanmıştır. Gerçek bir yatırım stratejisinde, günlük alım-satım işlemlerinin komisyon maliyeti, bid-ask spread'i ve piyasa etkisi (market impact) kârlılığı ciddi biçimde düşürebilir. Özellikle "flip stratejisi" (tahminleri ters çevirme), günlük işlem gerektirdiğinden yüksek işlem maliyetine maruz kalacaktır. Anti-prediktif davranışın "teorik" olarak kârlı olması, "pratik" olarak kârlı olacağı anlamına gelmemektedir.</w:t>
+      </w:r>
+    </w:p>
+    <w:p/>
+    <w:p>
+      <w:pPr>
+        <w:ind w:left="567"/>
+      </w:pPr>
+      <w:r>
+        <w:rPr>
+          <w:rFonts w:ascii="Consolas" w:hAnsi="Consolas"/>
+          <w:sz w:val="16"/>
+        </w:rPr>
+        <w:t>Gelecek Çalışmalar (İş Paketi 14): İşlem maliyetleri (komisyon: %0.1-0.3, spread: %0.05-0.15) dahil edilerek flip stratejisinin net getirisi hesaplanacaktır. Risk-adjusted metrikler (Sharpe Ratio, Maximum Drawdown) ile strateji değerlendirilecektir.</w:t>
+      </w:r>
+    </w:p>
+    <w:p/>
+    <w:p/>
+    <w:p>
+      <w:pPr>
+        <w:pStyle w:val="Heading2"/>
+      </w:pPr>
+      <w:r>
+        <w:t>15. Hayatta Kalma Yanlılığı (Survivorship Bias) Potansiyeli</w:t>
+      </w:r>
+    </w:p>
+    <w:p/>
+    <w:p>
+      <w:pPr>
+        <w:ind w:firstLine="425"/>
+      </w:pPr>
+      <w:r>
+        <w:t>Projede test edilen 11 BIST hissesinin tamamı, analiz dönemi boyunca borsada işlem gören ve aktif olan hisselerdir. Bu sürede borsadan çıkarılmış, iflas etmiş veya birleşme/devralma sonucu listeden çıkmış hisseler analiz dışında kalmıştır. Bu durum, sonuçların "hayatta kalan" hisselere doğru yanlı (biased) olma riskini taşımaktadır. Borsadan çıkarılmış hisselerin genellikle daha yüksek volatilite ve spekülatif davranış sergilediği göz önüne alındığında, anti-prediktif davranış oranı gerçekte daha yüksek olabilir.</w:t>
+      </w:r>
+    </w:p>
+    <w:p/>
+    <w:p>
+      <w:pPr>
+        <w:ind w:left="567"/>
+      </w:pPr>
+      <w:r>
+        <w:rPr>
+          <w:rFonts w:ascii="Consolas" w:hAnsi="Consolas"/>
+          <w:sz w:val="16"/>
+        </w:rPr>
+        <w:t>Gelecek Çalışmalar (İş Paketi 15): BIST'ten son 5 yılda çıkarılmış hisselerin verileri elde edilerek hayatta kalma yanlılığı analizi yapılacaktır.</w:t>
       </w:r>
     </w:p>
     <w:sectPr>

</xml_diff>